<commit_message>
Hallazgos resueltos y actualizacion de DU/PDF
</commit_message>
<xml_diff>
--- a/fuentes/CFA2_62330164_DU.docx
+++ b/fuentes/CFA2_62330164_DU.docx
@@ -92,7 +92,7 @@
               </wp:anchor>
             </w:drawing>
           </mc:Choice>
-          <mc:Fallback xmlns:w16sdtfl="http://schemas.microsoft.com/office/word/2024/wordml/sdtformatlock" xmlns:w16du="http://schemas.microsoft.com/office/word/2023/wordml/word16du" xmlns:oel="http://schemas.microsoft.com/office/2019/extlst">
+          <mc:Fallback xmlns:oel="http://schemas.microsoft.com/office/2019/extlst" xmlns:w16du="http://schemas.microsoft.com/office/word/2023/wordml/word16du" xmlns:w16sdtfl="http://schemas.microsoft.com/office/word/2024/wordml/sdtformatlock">
             <w:pict>
               <v:rect w14:anchorId="4E7873B1" id="Rectángulo 3" o:spid="_x0000_s1026" alt="&quot;&quot;" style="position:absolute;margin-left:-54pt;margin-top:31.65pt;width:613.85pt;height:204pt;z-index:-251655168;visibility:visible;mso-wrap-style:square;mso-height-percent:0;mso-wrap-distance-left:9pt;mso-wrap-distance-top:0;mso-wrap-distance-right:9pt;mso-wrap-distance-bottom:0;mso-position-horizontal:absolute;mso-position-horizontal-relative:text;mso-position-vertical:absolute;mso-position-vertical-relative:text;mso-height-percent:0;mso-height-relative:margin;v-text-anchor:middle" o:gfxdata="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" fillcolor="#00314d" stroked="f" strokeweight="1pt"/>
             </w:pict>
@@ -523,7 +523,7 @@
           <w:r>
             <w:fldChar w:fldCharType="separate"/>
           </w:r>
-          <w:hyperlink w:anchor="_Toc212563394" w:history="1">
+          <w:hyperlink w:anchor="_Toc212796964" w:history="1">
             <w:r>
               <w:rPr>
                 <w:rStyle w:val="Hipervnculo"/>
@@ -550,7 +550,7 @@
                 <w:noProof/>
                 <w:webHidden/>
               </w:rPr>
-              <w:instrText xml:space="preserve"> PAGEREF _Toc212563394 \h </w:instrText>
+              <w:instrText xml:space="preserve"> PAGEREF _Toc212796964 \h </w:instrText>
             </w:r>
             <w:r>
               <w:rPr>
@@ -597,7 +597,7 @@
               <w14:ligatures w14:val="none"/>
             </w:rPr>
           </w:pPr>
-          <w:hyperlink w:anchor="_Toc212563395" w:history="1">
+          <w:hyperlink w:anchor="_Toc212796965" w:history="1">
             <w:r>
               <w:rPr>
                 <w:rStyle w:val="Hipervnculo"/>
@@ -642,7 +642,7 @@
                 <w:noProof/>
                 <w:webHidden/>
               </w:rPr>
-              <w:instrText xml:space="preserve"> PAGEREF _Toc212563395 \h </w:instrText>
+              <w:instrText xml:space="preserve"> PAGEREF _Toc212796965 \h </w:instrText>
             </w:r>
             <w:r>
               <w:rPr>
@@ -685,7 +685,7 @@
               <w14:ligatures w14:val="none"/>
             </w:rPr>
           </w:pPr>
-          <w:hyperlink w:anchor="_Toc212563396" w:history="1">
+          <w:hyperlink w:anchor="_Toc212796966" w:history="1">
             <w:r>
               <w:rPr>
                 <w:rStyle w:val="Hipervnculo"/>
@@ -730,7 +730,7 @@
                 <w:noProof/>
                 <w:webHidden/>
               </w:rPr>
-              <w:instrText xml:space="preserve"> PAGEREF _Toc212563396 \h </w:instrText>
+              <w:instrText xml:space="preserve"> PAGEREF _Toc212796966 \h </w:instrText>
             </w:r>
             <w:r>
               <w:rPr>
@@ -773,7 +773,7 @@
               <w14:ligatures w14:val="none"/>
             </w:rPr>
           </w:pPr>
-          <w:hyperlink w:anchor="_Toc212563397" w:history="1">
+          <w:hyperlink w:anchor="_Toc212796967" w:history="1">
             <w:r>
               <w:rPr>
                 <w:rStyle w:val="Hipervnculo"/>
@@ -818,7 +818,7 @@
                 <w:noProof/>
                 <w:webHidden/>
               </w:rPr>
-              <w:instrText xml:space="preserve"> PAGEREF _Toc212563397 \h </w:instrText>
+              <w:instrText xml:space="preserve"> PAGEREF _Toc212796967 \h </w:instrText>
             </w:r>
             <w:r>
               <w:rPr>
@@ -861,7 +861,7 @@
               <w14:ligatures w14:val="none"/>
             </w:rPr>
           </w:pPr>
-          <w:hyperlink w:anchor="_Toc212563398" w:history="1">
+          <w:hyperlink w:anchor="_Toc212796968" w:history="1">
             <w:r>
               <w:rPr>
                 <w:rStyle w:val="Hipervnculo"/>
@@ -906,7 +906,7 @@
                 <w:noProof/>
                 <w:webHidden/>
               </w:rPr>
-              <w:instrText xml:space="preserve"> PAGEREF _Toc212563398 \h </w:instrText>
+              <w:instrText xml:space="preserve"> PAGEREF _Toc212796968 \h </w:instrText>
             </w:r>
             <w:r>
               <w:rPr>
@@ -949,7 +949,7 @@
               <w14:ligatures w14:val="none"/>
             </w:rPr>
           </w:pPr>
-          <w:hyperlink w:anchor="_Toc212563399" w:history="1">
+          <w:hyperlink w:anchor="_Toc212796969" w:history="1">
             <w:r>
               <w:rPr>
                 <w:rStyle w:val="Hipervnculo"/>
@@ -994,7 +994,7 @@
                 <w:noProof/>
                 <w:webHidden/>
               </w:rPr>
-              <w:instrText xml:space="preserve"> PAGEREF _Toc212563399 \h </w:instrText>
+              <w:instrText xml:space="preserve"> PAGEREF _Toc212796969 \h </w:instrText>
             </w:r>
             <w:r>
               <w:rPr>
@@ -1041,7 +1041,7 @@
               <w14:ligatures w14:val="none"/>
             </w:rPr>
           </w:pPr>
-          <w:hyperlink w:anchor="_Toc212563400" w:history="1">
+          <w:hyperlink w:anchor="_Toc212796970" w:history="1">
             <w:r>
               <w:rPr>
                 <w:rStyle w:val="Hipervnculo"/>
@@ -1086,7 +1086,7 @@
                 <w:noProof/>
                 <w:webHidden/>
               </w:rPr>
-              <w:instrText xml:space="preserve"> PAGEREF _Toc212563400 \h </w:instrText>
+              <w:instrText xml:space="preserve"> PAGEREF _Toc212796970 \h </w:instrText>
             </w:r>
             <w:r>
               <w:rPr>
@@ -1106,7 +1106,7 @@
                 <w:noProof/>
                 <w:webHidden/>
               </w:rPr>
-              <w:t>7</w:t>
+              <w:t>8</w:t>
             </w:r>
             <w:r>
               <w:rPr>
@@ -1129,7 +1129,7 @@
               <w14:ligatures w14:val="none"/>
             </w:rPr>
           </w:pPr>
-          <w:hyperlink w:anchor="_Toc212563401" w:history="1">
+          <w:hyperlink w:anchor="_Toc212796971" w:history="1">
             <w:r>
               <w:rPr>
                 <w:rStyle w:val="Hipervnculo"/>
@@ -1174,7 +1174,7 @@
                 <w:noProof/>
                 <w:webHidden/>
               </w:rPr>
-              <w:instrText xml:space="preserve"> PAGEREF _Toc212563401 \h </w:instrText>
+              <w:instrText xml:space="preserve"> PAGEREF _Toc212796971 \h </w:instrText>
             </w:r>
             <w:r>
               <w:rPr>
@@ -1194,7 +1194,7 @@
                 <w:noProof/>
                 <w:webHidden/>
               </w:rPr>
-              <w:t>7</w:t>
+              <w:t>8</w:t>
             </w:r>
             <w:r>
               <w:rPr>
@@ -1217,7 +1217,7 @@
               <w14:ligatures w14:val="none"/>
             </w:rPr>
           </w:pPr>
-          <w:hyperlink w:anchor="_Toc212563402" w:history="1">
+          <w:hyperlink w:anchor="_Toc212796972" w:history="1">
             <w:r>
               <w:rPr>
                 <w:rStyle w:val="Hipervnculo"/>
@@ -1262,7 +1262,7 @@
                 <w:noProof/>
                 <w:webHidden/>
               </w:rPr>
-              <w:instrText xml:space="preserve"> PAGEREF _Toc212563402 \h </w:instrText>
+              <w:instrText xml:space="preserve"> PAGEREF _Toc212796972 \h </w:instrText>
             </w:r>
             <w:r>
               <w:rPr>
@@ -1282,7 +1282,7 @@
                 <w:noProof/>
                 <w:webHidden/>
               </w:rPr>
-              <w:t>7</w:t>
+              <w:t>8</w:t>
             </w:r>
             <w:r>
               <w:rPr>
@@ -1305,7 +1305,7 @@
               <w14:ligatures w14:val="none"/>
             </w:rPr>
           </w:pPr>
-          <w:hyperlink w:anchor="_Toc212563403" w:history="1">
+          <w:hyperlink w:anchor="_Toc212796973" w:history="1">
             <w:r>
               <w:rPr>
                 <w:rStyle w:val="Hipervnculo"/>
@@ -1350,7 +1350,7 @@
                 <w:noProof/>
                 <w:webHidden/>
               </w:rPr>
-              <w:instrText xml:space="preserve"> PAGEREF _Toc212563403 \h </w:instrText>
+              <w:instrText xml:space="preserve"> PAGEREF _Toc212796973 \h </w:instrText>
             </w:r>
             <w:r>
               <w:rPr>
@@ -1370,7 +1370,7 @@
                 <w:noProof/>
                 <w:webHidden/>
               </w:rPr>
-              <w:t>9</w:t>
+              <w:t>10</w:t>
             </w:r>
             <w:r>
               <w:rPr>
@@ -1393,7 +1393,7 @@
               <w14:ligatures w14:val="none"/>
             </w:rPr>
           </w:pPr>
-          <w:hyperlink w:anchor="_Toc212563404" w:history="1">
+          <w:hyperlink w:anchor="_Toc212796974" w:history="1">
             <w:r>
               <w:rPr>
                 <w:rStyle w:val="Hipervnculo"/>
@@ -1421,7 +1421,10 @@
             </w:r>
             <w:r>
               <w:rPr>
-                <w:rStyle w:val="Extranjerismo"/>
+                <w:rStyle w:val="Hipervnculo"/>
+                <w:noProof/>
+                <w:spacing w:val="20"/>
+                <w:lang w:val="en-US"/>
               </w:rPr>
               <w:t>scripts</w:t>
             </w:r>
@@ -1444,7 +1447,7 @@
                 <w:noProof/>
                 <w:webHidden/>
               </w:rPr>
-              <w:instrText xml:space="preserve"> PAGEREF _Toc212563404 \h </w:instrText>
+              <w:instrText xml:space="preserve"> PAGEREF _Toc212796974 \h </w:instrText>
             </w:r>
             <w:r>
               <w:rPr>
@@ -1464,7 +1467,7 @@
                 <w:noProof/>
                 <w:webHidden/>
               </w:rPr>
-              <w:t>10</w:t>
+              <w:t>11</w:t>
             </w:r>
             <w:r>
               <w:rPr>
@@ -1491,7 +1494,7 @@
               <w14:ligatures w14:val="none"/>
             </w:rPr>
           </w:pPr>
-          <w:hyperlink w:anchor="_Toc212563405" w:history="1">
+          <w:hyperlink w:anchor="_Toc212796975" w:history="1">
             <w:r>
               <w:rPr>
                 <w:rStyle w:val="Hipervnculo"/>
@@ -1536,7 +1539,7 @@
                 <w:noProof/>
                 <w:webHidden/>
               </w:rPr>
-              <w:instrText xml:space="preserve"> PAGEREF _Toc212563405 \h </w:instrText>
+              <w:instrText xml:space="preserve"> PAGEREF _Toc212796975 \h </w:instrText>
             </w:r>
             <w:r>
               <w:rPr>
@@ -1556,7 +1559,7 @@
                 <w:noProof/>
                 <w:webHidden/>
               </w:rPr>
-              <w:t>12</w:t>
+              <w:t>13</w:t>
             </w:r>
             <w:r>
               <w:rPr>
@@ -1579,7 +1582,7 @@
               <w14:ligatures w14:val="none"/>
             </w:rPr>
           </w:pPr>
-          <w:hyperlink w:anchor="_Toc212563406" w:history="1">
+          <w:hyperlink w:anchor="_Toc212796976" w:history="1">
             <w:r>
               <w:rPr>
                 <w:rStyle w:val="Hipervnculo"/>
@@ -1624,7 +1627,7 @@
                 <w:noProof/>
                 <w:webHidden/>
               </w:rPr>
-              <w:instrText xml:space="preserve"> PAGEREF _Toc212563406 \h </w:instrText>
+              <w:instrText xml:space="preserve"> PAGEREF _Toc212796976 \h </w:instrText>
             </w:r>
             <w:r>
               <w:rPr>
@@ -1644,7 +1647,7 @@
                 <w:noProof/>
                 <w:webHidden/>
               </w:rPr>
-              <w:t>12</w:t>
+              <w:t>13</w:t>
             </w:r>
             <w:r>
               <w:rPr>
@@ -1667,7 +1670,7 @@
               <w14:ligatures w14:val="none"/>
             </w:rPr>
           </w:pPr>
-          <w:hyperlink w:anchor="_Toc212563407" w:history="1">
+          <w:hyperlink w:anchor="_Toc212796977" w:history="1">
             <w:r>
               <w:rPr>
                 <w:rStyle w:val="Hipervnculo"/>
@@ -1712,7 +1715,7 @@
                 <w:noProof/>
                 <w:webHidden/>
               </w:rPr>
-              <w:instrText xml:space="preserve"> PAGEREF _Toc212563407 \h </w:instrText>
+              <w:instrText xml:space="preserve"> PAGEREF _Toc212796977 \h </w:instrText>
             </w:r>
             <w:r>
               <w:rPr>
@@ -1732,7 +1735,7 @@
                 <w:noProof/>
                 <w:webHidden/>
               </w:rPr>
-              <w:t>13</w:t>
+              <w:t>15</w:t>
             </w:r>
             <w:r>
               <w:rPr>
@@ -1755,7 +1758,7 @@
               <w14:ligatures w14:val="none"/>
             </w:rPr>
           </w:pPr>
-          <w:hyperlink w:anchor="_Toc212563408" w:history="1">
+          <w:hyperlink w:anchor="_Toc212796978" w:history="1">
             <w:r>
               <w:rPr>
                 <w:rStyle w:val="Hipervnculo"/>
@@ -1800,7 +1803,7 @@
                 <w:noProof/>
                 <w:webHidden/>
               </w:rPr>
-              <w:instrText xml:space="preserve"> PAGEREF _Toc212563408 \h </w:instrText>
+              <w:instrText xml:space="preserve"> PAGEREF _Toc212796978 \h </w:instrText>
             </w:r>
             <w:r>
               <w:rPr>
@@ -1820,7 +1823,7 @@
                 <w:noProof/>
                 <w:webHidden/>
               </w:rPr>
-              <w:t>15</w:t>
+              <w:t>16</w:t>
             </w:r>
             <w:r>
               <w:rPr>
@@ -1843,7 +1846,7 @@
               <w14:ligatures w14:val="none"/>
             </w:rPr>
           </w:pPr>
-          <w:hyperlink w:anchor="_Toc212563409" w:history="1">
+          <w:hyperlink w:anchor="_Toc212796979" w:history="1">
             <w:r>
               <w:rPr>
                 <w:rStyle w:val="Hipervnculo"/>
@@ -1888,7 +1891,7 @@
                 <w:noProof/>
                 <w:webHidden/>
               </w:rPr>
-              <w:instrText xml:space="preserve"> PAGEREF _Toc212563409 \h </w:instrText>
+              <w:instrText xml:space="preserve"> PAGEREF _Toc212796979 \h </w:instrText>
             </w:r>
             <w:r>
               <w:rPr>
@@ -1908,7 +1911,7 @@
                 <w:noProof/>
                 <w:webHidden/>
               </w:rPr>
-              <w:t>16</w:t>
+              <w:t>17</w:t>
             </w:r>
             <w:r>
               <w:rPr>
@@ -1935,7 +1938,7 @@
               <w14:ligatures w14:val="none"/>
             </w:rPr>
           </w:pPr>
-          <w:hyperlink w:anchor="_Toc212563410" w:history="1">
+          <w:hyperlink w:anchor="_Toc212796980" w:history="1">
             <w:r>
               <w:rPr>
                 <w:rStyle w:val="Hipervnculo"/>
@@ -1980,7 +1983,7 @@
                 <w:noProof/>
                 <w:webHidden/>
               </w:rPr>
-              <w:instrText xml:space="preserve"> PAGEREF _Toc212563410 \h </w:instrText>
+              <w:instrText xml:space="preserve"> PAGEREF _Toc212796980 \h </w:instrText>
             </w:r>
             <w:r>
               <w:rPr>
@@ -2000,7 +2003,7 @@
                 <w:noProof/>
                 <w:webHidden/>
               </w:rPr>
-              <w:t>18</w:t>
+              <w:t>19</w:t>
             </w:r>
             <w:r>
               <w:rPr>
@@ -2023,7 +2026,7 @@
               <w14:ligatures w14:val="none"/>
             </w:rPr>
           </w:pPr>
-          <w:hyperlink w:anchor="_Toc212563411" w:history="1">
+          <w:hyperlink w:anchor="_Toc212796981" w:history="1">
             <w:r>
               <w:rPr>
                 <w:rStyle w:val="Hipervnculo"/>
@@ -2068,7 +2071,7 @@
                 <w:noProof/>
                 <w:webHidden/>
               </w:rPr>
-              <w:instrText xml:space="preserve"> PAGEREF _Toc212563411 \h </w:instrText>
+              <w:instrText xml:space="preserve"> PAGEREF _Toc212796981 \h </w:instrText>
             </w:r>
             <w:r>
               <w:rPr>
@@ -2088,7 +2091,7 @@
                 <w:noProof/>
                 <w:webHidden/>
               </w:rPr>
-              <w:t>18</w:t>
+              <w:t>19</w:t>
             </w:r>
             <w:r>
               <w:rPr>
@@ -2111,7 +2114,7 @@
               <w14:ligatures w14:val="none"/>
             </w:rPr>
           </w:pPr>
-          <w:hyperlink w:anchor="_Toc212563412" w:history="1">
+          <w:hyperlink w:anchor="_Toc212796982" w:history="1">
             <w:r>
               <w:rPr>
                 <w:rStyle w:val="Hipervnculo"/>
@@ -2156,7 +2159,7 @@
                 <w:noProof/>
                 <w:webHidden/>
               </w:rPr>
-              <w:instrText xml:space="preserve"> PAGEREF _Toc212563412 \h </w:instrText>
+              <w:instrText xml:space="preserve"> PAGEREF _Toc212796982 \h </w:instrText>
             </w:r>
             <w:r>
               <w:rPr>
@@ -2176,7 +2179,7 @@
                 <w:noProof/>
                 <w:webHidden/>
               </w:rPr>
-              <w:t>18</w:t>
+              <w:t>19</w:t>
             </w:r>
             <w:r>
               <w:rPr>
@@ -2199,7 +2202,7 @@
               <w14:ligatures w14:val="none"/>
             </w:rPr>
           </w:pPr>
-          <w:hyperlink w:anchor="_Toc212563413" w:history="1">
+          <w:hyperlink w:anchor="_Toc212796983" w:history="1">
             <w:r>
               <w:rPr>
                 <w:rStyle w:val="Hipervnculo"/>
@@ -2244,7 +2247,7 @@
                 <w:noProof/>
                 <w:webHidden/>
               </w:rPr>
-              <w:instrText xml:space="preserve"> PAGEREF _Toc212563413 \h </w:instrText>
+              <w:instrText xml:space="preserve"> PAGEREF _Toc212796983 \h </w:instrText>
             </w:r>
             <w:r>
               <w:rPr>
@@ -2264,7 +2267,7 @@
                 <w:noProof/>
                 <w:webHidden/>
               </w:rPr>
-              <w:t>19</w:t>
+              <w:t>20</w:t>
             </w:r>
             <w:r>
               <w:rPr>
@@ -2287,7 +2290,7 @@
               <w14:ligatures w14:val="none"/>
             </w:rPr>
           </w:pPr>
-          <w:hyperlink w:anchor="_Toc212563414" w:history="1">
+          <w:hyperlink w:anchor="_Toc212796984" w:history="1">
             <w:r>
               <w:rPr>
                 <w:rStyle w:val="Hipervnculo"/>
@@ -2332,7 +2335,7 @@
                 <w:noProof/>
                 <w:webHidden/>
               </w:rPr>
-              <w:instrText xml:space="preserve"> PAGEREF _Toc212563414 \h </w:instrText>
+              <w:instrText xml:space="preserve"> PAGEREF _Toc212796984 \h </w:instrText>
             </w:r>
             <w:r>
               <w:rPr>
@@ -2352,7 +2355,7 @@
                 <w:noProof/>
                 <w:webHidden/>
               </w:rPr>
-              <w:t>20</w:t>
+              <w:t>21</w:t>
             </w:r>
             <w:r>
               <w:rPr>
@@ -2375,7 +2378,7 @@
               <w14:ligatures w14:val="none"/>
             </w:rPr>
           </w:pPr>
-          <w:hyperlink w:anchor="_Toc212563415" w:history="1">
+          <w:hyperlink w:anchor="_Toc212796985" w:history="1">
             <w:r>
               <w:rPr>
                 <w:rStyle w:val="Hipervnculo"/>
@@ -2420,7 +2423,7 @@
                 <w:noProof/>
                 <w:webHidden/>
               </w:rPr>
-              <w:instrText xml:space="preserve"> PAGEREF _Toc212563415 \h </w:instrText>
+              <w:instrText xml:space="preserve"> PAGEREF _Toc212796985 \h </w:instrText>
             </w:r>
             <w:r>
               <w:rPr>
@@ -2440,7 +2443,7 @@
                 <w:noProof/>
                 <w:webHidden/>
               </w:rPr>
-              <w:t>21</w:t>
+              <w:t>22</w:t>
             </w:r>
             <w:r>
               <w:rPr>
@@ -2466,7 +2469,7 @@
               <w14:ligatures w14:val="none"/>
             </w:rPr>
           </w:pPr>
-          <w:hyperlink w:anchor="_Toc212563416" w:history="1">
+          <w:hyperlink w:anchor="_Toc212796986" w:history="1">
             <w:r>
               <w:rPr>
                 <w:rStyle w:val="Hipervnculo"/>
@@ -2493,7 +2496,7 @@
                 <w:noProof/>
                 <w:webHidden/>
               </w:rPr>
-              <w:instrText xml:space="preserve"> PAGEREF _Toc212563416 \h </w:instrText>
+              <w:instrText xml:space="preserve"> PAGEREF _Toc212796986 \h </w:instrText>
             </w:r>
             <w:r>
               <w:rPr>
@@ -2513,7 +2516,7 @@
                 <w:noProof/>
                 <w:webHidden/>
               </w:rPr>
-              <w:t>23</w:t>
+              <w:t>24</w:t>
             </w:r>
             <w:r>
               <w:rPr>
@@ -2539,7 +2542,7 @@
               <w14:ligatures w14:val="none"/>
             </w:rPr>
           </w:pPr>
-          <w:hyperlink w:anchor="_Toc212563417" w:history="1">
+          <w:hyperlink w:anchor="_Toc212796987" w:history="1">
             <w:r>
               <w:rPr>
                 <w:rStyle w:val="Hipervnculo"/>
@@ -2566,7 +2569,7 @@
                 <w:noProof/>
                 <w:webHidden/>
               </w:rPr>
-              <w:instrText xml:space="preserve"> PAGEREF _Toc212563417 \h </w:instrText>
+              <w:instrText xml:space="preserve"> PAGEREF _Toc212796987 \h </w:instrText>
             </w:r>
             <w:r>
               <w:rPr>
@@ -2586,7 +2589,7 @@
                 <w:noProof/>
                 <w:webHidden/>
               </w:rPr>
-              <w:t>25</w:t>
+              <w:t>26</w:t>
             </w:r>
             <w:r>
               <w:rPr>
@@ -2612,7 +2615,7 @@
               <w14:ligatures w14:val="none"/>
             </w:rPr>
           </w:pPr>
-          <w:hyperlink w:anchor="_Toc212563418" w:history="1">
+          <w:hyperlink w:anchor="_Toc212796988" w:history="1">
             <w:r>
               <w:rPr>
                 <w:rStyle w:val="Hipervnculo"/>
@@ -2639,7 +2642,7 @@
                 <w:noProof/>
                 <w:webHidden/>
               </w:rPr>
-              <w:instrText xml:space="preserve"> PAGEREF _Toc212563418 \h </w:instrText>
+              <w:instrText xml:space="preserve"> PAGEREF _Toc212796988 \h </w:instrText>
             </w:r>
             <w:r>
               <w:rPr>
@@ -2659,7 +2662,7 @@
                 <w:noProof/>
                 <w:webHidden/>
               </w:rPr>
-              <w:t>27</w:t>
+              <w:t>28</w:t>
             </w:r>
             <w:r>
               <w:rPr>
@@ -2685,7 +2688,7 @@
               <w14:ligatures w14:val="none"/>
             </w:rPr>
           </w:pPr>
-          <w:hyperlink w:anchor="_Toc212563419" w:history="1">
+          <w:hyperlink w:anchor="_Toc212796989" w:history="1">
             <w:r>
               <w:rPr>
                 <w:rStyle w:val="Hipervnculo"/>
@@ -2712,7 +2715,7 @@
                 <w:noProof/>
                 <w:webHidden/>
               </w:rPr>
-              <w:instrText xml:space="preserve"> PAGEREF _Toc212563419 \h </w:instrText>
+              <w:instrText xml:space="preserve"> PAGEREF _Toc212796989 \h </w:instrText>
             </w:r>
             <w:r>
               <w:rPr>
@@ -2732,7 +2735,7 @@
                 <w:noProof/>
                 <w:webHidden/>
               </w:rPr>
-              <w:t>28</w:t>
+              <w:t>29</w:t>
             </w:r>
             <w:r>
               <w:rPr>
@@ -2758,7 +2761,7 @@
               <w14:ligatures w14:val="none"/>
             </w:rPr>
           </w:pPr>
-          <w:hyperlink w:anchor="_Toc212563420" w:history="1">
+          <w:hyperlink w:anchor="_Toc212796990" w:history="1">
             <w:r>
               <w:rPr>
                 <w:rStyle w:val="Hipervnculo"/>
@@ -2785,7 +2788,7 @@
                 <w:noProof/>
                 <w:webHidden/>
               </w:rPr>
-              <w:instrText xml:space="preserve"> PAGEREF _Toc212563420 \h </w:instrText>
+              <w:instrText xml:space="preserve"> PAGEREF _Toc212796990 \h </w:instrText>
             </w:r>
             <w:r>
               <w:rPr>
@@ -2805,7 +2808,7 @@
                 <w:noProof/>
                 <w:webHidden/>
               </w:rPr>
-              <w:t>29</w:t>
+              <w:t>30</w:t>
             </w:r>
             <w:r>
               <w:rPr>
@@ -2850,7 +2853,7 @@
       <w:pPr>
         <w:pStyle w:val="Titulosgenerales"/>
       </w:pPr>
-      <w:bookmarkStart w:id="0" w:name="_Toc212563394"/>
+      <w:bookmarkStart w:id="0" w:name="_Toc212796964"/>
       <w:r>
         <w:lastRenderedPageBreak/>
         <w:t>Introducción</w:t>
@@ -3129,7 +3132,13 @@
               </w:rPr>
             </w:pPr>
             <w:r>
-              <w:t>¡Le invitamos a apropiarse de estos conceptos y aplicarlos con criterio para construir propuestas comerciales que no solo informen, sino que conecten, persuadan y generen valor real en cada interacción con sus clientes!”</w:t>
+              <w:t>“</w:t>
+            </w:r>
+            <w:r>
+              <w:t>¡Le invitamos a apropiarse de estos conceptos y aplicarlos con criterio para construir propuestas comerciales que no solo informen, sino que conecten, persuadan y generen valor real en cada interacción con sus clientes!</w:t>
+            </w:r>
+            <w:r>
+              <w:t>”</w:t>
             </w:r>
           </w:p>
         </w:tc>
@@ -3154,7 +3163,7 @@
       <w:pPr>
         <w:pStyle w:val="Ttulo1"/>
       </w:pPr>
-      <w:bookmarkStart w:id="1" w:name="_Toc212563395"/>
+      <w:bookmarkStart w:id="1" w:name="_Toc212796965"/>
       <w:r>
         <w:lastRenderedPageBreak/>
         <w:t>Comunicación comercial</w:t>
@@ -3199,7 +3208,7 @@
       <w:pPr>
         <w:pStyle w:val="Ttulo2"/>
       </w:pPr>
-      <w:bookmarkStart w:id="2" w:name="_Toc212563396"/>
+      <w:bookmarkStart w:id="2" w:name="_Toc212796966"/>
       <w:r>
         <w:t>Concepto</w:t>
       </w:r>
@@ -3231,7 +3240,7 @@
       <w:pPr>
         <w:pStyle w:val="Ttulo2"/>
       </w:pPr>
-      <w:bookmarkStart w:id="3" w:name="_Toc212563397"/>
+      <w:bookmarkStart w:id="3" w:name="_Toc212796967"/>
       <w:r>
         <w:t>Elementos</w:t>
       </w:r>
@@ -3492,7 +3501,7 @@
       <w:pPr>
         <w:pStyle w:val="Ttulo2"/>
       </w:pPr>
-      <w:bookmarkStart w:id="4" w:name="_Toc212563398"/>
+      <w:bookmarkStart w:id="4" w:name="_Toc212796968"/>
       <w:r>
         <w:lastRenderedPageBreak/>
         <w:t>Interferencias</w:t>
@@ -3605,7 +3614,7 @@
       <w:pPr>
         <w:pStyle w:val="Ttulo2"/>
       </w:pPr>
-      <w:bookmarkStart w:id="5" w:name="_Toc212563399"/>
+      <w:bookmarkStart w:id="5" w:name="_Toc212796969"/>
       <w:r>
         <w:t>Herramientas digitales</w:t>
       </w:r>
@@ -3699,10 +3708,10 @@
           <w:lang w:val="es-419" w:eastAsia="es-CO"/>
         </w:rPr>
         <w:drawing>
-          <wp:inline distT="0" distB="0" distL="0" distR="0" wp14:anchorId="2B813D15" wp14:editId="29B16B86">
-            <wp:extent cx="3672963" cy="3200400"/>
-            <wp:effectExtent l="0" t="0" r="3810" b="0"/>
-            <wp:docPr id="2" name="Imagen 2" descr="La figura muestra cinco diferentes herramientas digitales para la comunicación comercial. Entre estas tenemos: Canva, Genially, PowerPoint, HubSpot CRM y Google Slidess."/>
+          <wp:inline distT="0" distB="0" distL="0" distR="0" wp14:anchorId="2B813D15" wp14:editId="7E49460A">
+            <wp:extent cx="3774559" cy="3288926"/>
+            <wp:effectExtent l="0" t="0" r="0" b="6985"/>
+            <wp:docPr id="2" name="Imagen 2" descr="La figura muestra cinco diferentes herramientas digitales para la comunicación comercial. Entre estas tenemos: Canva, Genially, PowerPoint, HubSpot CRM y Google Slidess.&#10;A continuación se  explica cada una de las herramientas."/>
             <wp:cNvGraphicFramePr>
               <a:graphicFrameLocks xmlns:a="http://schemas.openxmlformats.org/drawingml/2006/main" noChangeAspect="1"/>
             </wp:cNvGraphicFramePr>
@@ -3710,7 +3719,7 @@
               <a:graphicData uri="http://schemas.openxmlformats.org/drawingml/2006/picture">
                 <pic:pic xmlns:pic="http://schemas.openxmlformats.org/drawingml/2006/picture">
                   <pic:nvPicPr>
-                    <pic:cNvPr id="2" name="Imagen 2" descr="La figura muestra cinco diferentes herramientas digitales para la comunicación comercial. Entre estas tenemos: Canva, Genially, PowerPoint, HubSpot CRM y Google Slidess."/>
+                    <pic:cNvPr id="2" name="Imagen 2" descr="La figura muestra cinco diferentes herramientas digitales para la comunicación comercial. Entre estas tenemos: Canva, Genially, PowerPoint, HubSpot CRM y Google Slidess.&#10;A continuación se  explica cada una de las herramientas."/>
                     <pic:cNvPicPr/>
                   </pic:nvPicPr>
                   <pic:blipFill>
@@ -3728,7 +3737,7 @@
                   <pic:spPr>
                     <a:xfrm>
                       <a:off x="0" y="0"/>
-                      <a:ext cx="3683057" cy="3209196"/>
+                      <a:ext cx="3805079" cy="3315519"/>
                     </a:xfrm>
                     <a:prstGeom prst="rect">
                       <a:avLst/>
@@ -3791,9 +3800,161 @@
     </w:p>
     <w:p>
       <w:pPr>
+        <w:rPr>
+          <w:szCs w:val="28"/>
+          <w:lang w:val="es-419" w:eastAsia="es-CO"/>
+        </w:rPr>
+      </w:pPr>
+      <w:r>
+        <w:rPr>
+          <w:b/>
+          <w:bCs/>
+          <w:szCs w:val="28"/>
+          <w:lang w:val="es-419" w:eastAsia="es-CO"/>
+        </w:rPr>
+        <w:lastRenderedPageBreak/>
+        <w:t>Canva</w:t>
+      </w:r>
+      <w:r>
+        <w:rPr>
+          <w:szCs w:val="28"/>
+          <w:lang w:val="es-419" w:eastAsia="es-CO"/>
+        </w:rPr>
+        <w:t xml:space="preserve">: </w:t>
+      </w:r>
+      <w:r>
+        <w:rPr>
+          <w:szCs w:val="28"/>
+          <w:lang w:val="es-419" w:eastAsia="es-CO"/>
+        </w:rPr>
+        <w:t>d</w:t>
+      </w:r>
+      <w:r>
+        <w:rPr>
+          <w:szCs w:val="28"/>
+          <w:lang w:val="es-419" w:eastAsia="es-CO"/>
+        </w:rPr>
+        <w:t>iseño gráfico intuitivo, plantillas personalizables. Creación de propuestas visuales con identidad de marca.</w:t>
+      </w:r>
+    </w:p>
+    <w:p>
+      <w:pPr>
+        <w:rPr>
+          <w:szCs w:val="28"/>
+          <w:lang w:val="es-419" w:eastAsia="es-CO"/>
+        </w:rPr>
+      </w:pPr>
+      <w:r>
+        <w:rPr>
+          <w:b/>
+          <w:bCs/>
+          <w:szCs w:val="28"/>
+          <w:lang w:val="es-419" w:eastAsia="es-CO"/>
+        </w:rPr>
+        <w:t>Genially:</w:t>
+      </w:r>
+      <w:r>
+        <w:rPr>
+          <w:szCs w:val="28"/>
+          <w:lang w:val="es-419" w:eastAsia="es-CO"/>
+        </w:rPr>
+        <w:t xml:space="preserve"> presentaciones interactivas, integración multimedia. Propuestas con videos, enlaces y animaciones.</w:t>
+      </w:r>
+    </w:p>
+    <w:p>
+      <w:pPr>
+        <w:rPr>
+          <w:szCs w:val="28"/>
+          <w:lang w:val="es-419" w:eastAsia="es-CO"/>
+        </w:rPr>
+      </w:pPr>
+      <w:r>
+        <w:rPr>
+          <w:b/>
+          <w:bCs/>
+          <w:szCs w:val="28"/>
+          <w:lang w:val="es-419" w:eastAsia="es-CO"/>
+        </w:rPr>
+        <w:t>PowerPoint</w:t>
+      </w:r>
+      <w:r>
+        <w:rPr>
+          <w:szCs w:val="28"/>
+          <w:lang w:val="es-419" w:eastAsia="es-CO"/>
+        </w:rPr>
+        <w:t>: presentación estructurada, fácil de compartir. Propuestas formales para reuniones o envíos por correo.</w:t>
+      </w:r>
+    </w:p>
+    <w:p>
+      <w:pPr>
+        <w:rPr>
+          <w:szCs w:val="28"/>
+          <w:lang w:val="es-419" w:eastAsia="es-CO"/>
+        </w:rPr>
+      </w:pPr>
+      <w:r>
+        <w:rPr>
+          <w:b/>
+          <w:bCs/>
+          <w:szCs w:val="28"/>
+          <w:lang w:val="es-419" w:eastAsia="es-CO"/>
+        </w:rPr>
+        <w:t>HubSpot CRM</w:t>
+      </w:r>
+      <w:r>
+        <w:rPr>
+          <w:szCs w:val="28"/>
+          <w:lang w:val="es-419" w:eastAsia="es-CO"/>
+        </w:rPr>
+        <w:t>: seguimiento de clientes, automatización de correos. Envío y monitoreo de propuestas personalizadas.</w:t>
+      </w:r>
+    </w:p>
+    <w:p>
+      <w:pPr>
+        <w:rPr>
+          <w:szCs w:val="28"/>
+          <w:lang w:val="es-419" w:eastAsia="es-CO"/>
+        </w:rPr>
+      </w:pPr>
+      <w:r>
+        <w:rPr>
+          <w:b/>
+          <w:bCs/>
+          <w:szCs w:val="28"/>
+          <w:lang w:val="es-419" w:eastAsia="es-CO"/>
+        </w:rPr>
+        <w:t>Google Slides</w:t>
+      </w:r>
+      <w:r>
+        <w:rPr>
+          <w:szCs w:val="28"/>
+          <w:lang w:val="es-419" w:eastAsia="es-CO"/>
+        </w:rPr>
+        <w:t>: colaboración en línea, acceso multiplataforma. Propuestas colaborativas en equipos de ventas.</w:t>
+      </w:r>
+    </w:p>
+    <w:p>
+      <w:pPr>
+        <w:spacing w:before="0" w:after="160" w:line="259" w:lineRule="auto"/>
+        <w:ind w:firstLine="0"/>
+        <w:rPr>
+          <w:szCs w:val="28"/>
+          <w:lang w:val="es-419" w:eastAsia="es-CO"/>
+        </w:rPr>
+      </w:pPr>
+      <w:r>
+        <w:rPr>
+          <w:szCs w:val="28"/>
+          <w:lang w:val="es-419" w:eastAsia="es-CO"/>
+        </w:rPr>
+        <w:br w:type="page"/>
+      </w:r>
+    </w:p>
+    <w:p>
+      <w:pPr>
         <w:pStyle w:val="Ttulo1"/>
       </w:pPr>
-      <w:bookmarkStart w:id="6" w:name="_Toc212563400"/>
+      <w:bookmarkStart w:id="6" w:name="_Toc212796970"/>
       <w:r>
         <w:lastRenderedPageBreak/>
         <w:t>Negociación</w:t>
@@ -3851,7 +4012,7 @@
       <w:pPr>
         <w:pStyle w:val="Ttulo2"/>
       </w:pPr>
-      <w:bookmarkStart w:id="7" w:name="_Toc212563401"/>
+      <w:bookmarkStart w:id="7" w:name="_Toc212796971"/>
       <w:r>
         <w:t>Concepto</w:t>
       </w:r>
@@ -3883,7 +4044,7 @@
       <w:pPr>
         <w:pStyle w:val="Ttulo2"/>
       </w:pPr>
-      <w:bookmarkStart w:id="8" w:name="_Toc212563402"/>
+      <w:bookmarkStart w:id="8" w:name="_Toc212796972"/>
       <w:r>
         <w:t>Modelos</w:t>
       </w:r>
@@ -4511,7 +4672,7 @@
       <w:pPr>
         <w:pStyle w:val="Ttulo2"/>
       </w:pPr>
-      <w:bookmarkStart w:id="9" w:name="_Toc212563403"/>
+      <w:bookmarkStart w:id="9" w:name="_Toc212796973"/>
       <w:r>
         <w:lastRenderedPageBreak/>
         <w:t>Técnicas de anclaje</w:t>
@@ -4528,7 +4689,19 @@
         <w:rPr>
           <w:lang w:val="es-419" w:eastAsia="es-CO"/>
         </w:rPr>
-        <w:t>Las técnicas de anclaje y persuasión son herramientas psicológicas que influyen en la percepción del cliente durante la negociación. El anclaje consiste en presentar una primera cifra o propuesta que sirva como punto de referencia, condicionando las decisiones posteriores (Kahneman, 2011). Por ejemplo, si una empresa ofrece inicialmente un paquete premium de $1.200.000, cualquier oferta posterior parecerá más accesible en comparación.</w:t>
+        <w:t xml:space="preserve">Las técnicas de anclaje y persuasión son herramientas psicológicas que influyen en la percepción del cliente durante la negociación. El anclaje consiste en presentar una primera cifra o propuesta que sirva como punto de referencia, condicionando las decisiones posteriores (Kahneman, 2011). Por ejemplo, si una empresa ofrece inicialmente un paquete </w:t>
+      </w:r>
+      <w:r>
+        <w:rPr>
+          <w:rStyle w:val="Extranjerismo"/>
+        </w:rPr>
+        <w:t>premium</w:t>
+      </w:r>
+      <w:r>
+        <w:rPr>
+          <w:lang w:val="es-419" w:eastAsia="es-CO"/>
+        </w:rPr>
+        <w:t xml:space="preserve"> de $1.200.000, cualquier oferta posterior parecerá más accesible en comparación.</w:t>
       </w:r>
     </w:p>
     <w:p>
@@ -4830,7 +5003,7 @@
       <w:pPr>
         <w:pStyle w:val="Ttulo2"/>
       </w:pPr>
-      <w:bookmarkStart w:id="10" w:name="_Toc212563404"/>
+      <w:bookmarkStart w:id="10" w:name="_Toc212796974"/>
       <w:r>
         <w:t xml:space="preserve">Desarrollo de </w:t>
       </w:r>
@@ -5562,7 +5735,7 @@
       <w:pPr>
         <w:pStyle w:val="Ttulo1"/>
       </w:pPr>
-      <w:bookmarkStart w:id="11" w:name="_Toc212563405"/>
+      <w:bookmarkStart w:id="11" w:name="_Toc212796975"/>
       <w:r>
         <w:lastRenderedPageBreak/>
         <w:t>Seguimiento</w:t>
@@ -5599,7 +5772,7 @@
       <w:pPr>
         <w:pStyle w:val="Ttulo2"/>
       </w:pPr>
-      <w:bookmarkStart w:id="12" w:name="_Toc212563406"/>
+      <w:bookmarkStart w:id="12" w:name="_Toc212796976"/>
       <w:r>
         <w:t>Técnicas de seguimiento</w:t>
       </w:r>
@@ -5705,10 +5878,10 @@
           <w:lang w:val="es-419" w:eastAsia="es-CO"/>
         </w:rPr>
         <w:drawing>
-          <wp:inline distT="0" distB="0" distL="0" distR="0" wp14:anchorId="315E7767" wp14:editId="0FD60BF5">
+          <wp:inline distT="0" distB="0" distL="0" distR="0" wp14:anchorId="315E7767" wp14:editId="679E1616">
             <wp:extent cx="5082363" cy="3304749"/>
             <wp:effectExtent l="0" t="0" r="4445" b="0"/>
-            <wp:docPr id="11" name="Imagen 11" descr="La figura relaciona cuatro técnicas de seguimiento comercial. La primera es la llamada telefónica; la segunda es el correo personalizado, la tercera es la reunión de seguimiento y finalmente el contenido adicional."/>
+            <wp:docPr id="11" name="Imagen 11" descr="La figura relaciona cuatro técnicas de seguimiento comercial. La primera es la llamada telefónica; la segunda es el correo personalizado, la tercera es la reunión de seguimiento y finalmente el contenido adicional.&#10;A continuación se explica cada una."/>
             <wp:cNvGraphicFramePr>
               <a:graphicFrameLocks xmlns:a="http://schemas.openxmlformats.org/drawingml/2006/main" noChangeAspect="1"/>
             </wp:cNvGraphicFramePr>
@@ -5716,7 +5889,7 @@
               <a:graphicData uri="http://schemas.openxmlformats.org/drawingml/2006/picture">
                 <pic:pic xmlns:pic="http://schemas.openxmlformats.org/drawingml/2006/picture">
                   <pic:nvPicPr>
-                    <pic:cNvPr id="11" name="Imagen 11" descr="La figura relaciona cuatro técnicas de seguimiento comercial. La primera es la llamada telefónica; la segunda es el correo personalizado, la tercera es la reunión de seguimiento y finalmente el contenido adicional."/>
+                    <pic:cNvPr id="11" name="Imagen 11" descr="La figura relaciona cuatro técnicas de seguimiento comercial. La primera es la llamada telefónica; la segunda es el correo personalizado, la tercera es la reunión de seguimiento y finalmente el contenido adicional.&#10;A continuación se explica cada una."/>
                     <pic:cNvPicPr/>
                   </pic:nvPicPr>
                   <pic:blipFill>
@@ -5771,9 +5944,122 @@
     </w:p>
     <w:p>
       <w:pPr>
+        <w:ind w:firstLine="708"/>
+        <w:rPr>
+          <w:sz w:val="24"/>
+          <w:szCs w:val="24"/>
+          <w:lang w:val="es-419" w:eastAsia="es-CO"/>
+        </w:rPr>
+      </w:pPr>
+      <w:r>
+        <w:rPr>
+          <w:b/>
+          <w:bCs/>
+          <w:sz w:val="24"/>
+          <w:szCs w:val="24"/>
+          <w:lang w:val="es-419" w:eastAsia="es-CO"/>
+        </w:rPr>
+        <w:t>Llamada telefónica</w:t>
+      </w:r>
+      <w:r>
+        <w:rPr>
+          <w:sz w:val="24"/>
+          <w:szCs w:val="24"/>
+          <w:lang w:val="es-419" w:eastAsia="es-CO"/>
+        </w:rPr>
+        <w:t>: contacto directo, permite resolver dudas. Ejemplo: “¿Tuviste oportunidad de revisar la propuesta?”.</w:t>
+      </w:r>
+    </w:p>
+    <w:p>
+      <w:pPr>
+        <w:ind w:firstLine="708"/>
+        <w:rPr>
+          <w:sz w:val="24"/>
+          <w:szCs w:val="24"/>
+          <w:lang w:val="es-419" w:eastAsia="es-CO"/>
+        </w:rPr>
+      </w:pPr>
+      <w:r>
+        <w:rPr>
+          <w:b/>
+          <w:bCs/>
+          <w:sz w:val="24"/>
+          <w:szCs w:val="24"/>
+          <w:lang w:val="es-419" w:eastAsia="es-CO"/>
+        </w:rPr>
+        <w:t>Correo personalizado</w:t>
+      </w:r>
+      <w:r>
+        <w:rPr>
+          <w:sz w:val="24"/>
+          <w:szCs w:val="24"/>
+          <w:lang w:val="es-419" w:eastAsia="es-CO"/>
+        </w:rPr>
+        <w:t>: refuerza el mensaje, permite adjuntar contenido. Ejemplo: envío de catálogo digital con beneficios adicionales.</w:t>
+      </w:r>
+    </w:p>
+    <w:p>
+      <w:pPr>
+        <w:ind w:firstLine="708"/>
+        <w:rPr>
+          <w:sz w:val="24"/>
+          <w:szCs w:val="24"/>
+          <w:lang w:val="es-419" w:eastAsia="es-CO"/>
+        </w:rPr>
+      </w:pPr>
+      <w:r>
+        <w:rPr>
+          <w:b/>
+          <w:bCs/>
+          <w:sz w:val="24"/>
+          <w:szCs w:val="24"/>
+          <w:lang w:val="es-419" w:eastAsia="es-CO"/>
+        </w:rPr>
+        <w:t>Reunión de seguimiento</w:t>
+      </w:r>
+      <w:r>
+        <w:rPr>
+          <w:sz w:val="24"/>
+          <w:szCs w:val="24"/>
+          <w:lang w:val="es-419" w:eastAsia="es-CO"/>
+        </w:rPr>
+        <w:t>: espacio para aclarar dudas y negociar detalles. Ejemplo: agenda virtual para revisar condiciones comerciales.</w:t>
+      </w:r>
+    </w:p>
+    <w:p>
+      <w:pPr>
+        <w:ind w:firstLine="708"/>
+        <w:rPr>
+          <w:sz w:val="24"/>
+          <w:szCs w:val="24"/>
+          <w:lang w:val="es-419" w:eastAsia="es-CO"/>
+        </w:rPr>
+      </w:pPr>
+      <w:r>
+        <w:rPr>
+          <w:b/>
+          <w:bCs/>
+          <w:sz w:val="24"/>
+          <w:szCs w:val="24"/>
+          <w:lang w:val="es-419" w:eastAsia="es-CO"/>
+        </w:rPr>
+        <w:lastRenderedPageBreak/>
+        <w:t>Contenido adicional</w:t>
+      </w:r>
+      <w:r>
+        <w:rPr>
+          <w:sz w:val="24"/>
+          <w:szCs w:val="24"/>
+          <w:lang w:val="es-419" w:eastAsia="es-CO"/>
+        </w:rPr>
+        <w:t>: aporta valor, mantiene el interés. Ejemplo: video de uso del producto en entrenamiento funcional.</w:t>
+      </w:r>
+    </w:p>
+    <w:p>
+      <w:pPr>
         <w:pStyle w:val="Ttulo2"/>
       </w:pPr>
-      <w:bookmarkStart w:id="13" w:name="_Toc212563407"/>
+      <w:bookmarkStart w:id="13" w:name="_Toc212796977"/>
       <w:r>
         <w:t>Herramientas de seguimiento</w:t>
       </w:r>
@@ -5802,7 +6088,6 @@
         <w:rPr>
           <w:lang w:val="es-419" w:eastAsia="es-CO"/>
         </w:rPr>
-        <w:lastRenderedPageBreak/>
         <w:t>Según Kotler y Keller (2022), los sistemas CRM (</w:t>
       </w:r>
       <w:r>
@@ -6221,6 +6506,7 @@
                 <w:color w:val="000000" w:themeColor="text1"/>
                 <w:szCs w:val="24"/>
               </w:rPr>
+              <w:lastRenderedPageBreak/>
               <w:t>Zoho CRM</w:t>
             </w:r>
           </w:p>
@@ -6430,7 +6716,6 @@
                 <w:color w:val="000000" w:themeColor="text1"/>
                 <w:szCs w:val="24"/>
               </w:rPr>
-              <w:lastRenderedPageBreak/>
               <w:t>WhatsApp Business</w:t>
             </w:r>
           </w:p>
@@ -6574,7 +6859,7 @@
       <w:pPr>
         <w:pStyle w:val="Ttulo2"/>
       </w:pPr>
-      <w:bookmarkStart w:id="14" w:name="_Toc212563408"/>
+      <w:bookmarkStart w:id="14" w:name="_Toc212796978"/>
       <w:r>
         <w:t>Protocolos</w:t>
       </w:r>
@@ -6639,12 +6924,20 @@
           <w:lang w:val="es-419" w:eastAsia="es-CO"/>
         </w:rPr>
       </w:pPr>
+    </w:p>
+    <w:p>
+      <w:pPr>
+        <w:rPr>
+          <w:lang w:val="es-419" w:eastAsia="es-CO"/>
+        </w:rPr>
+      </w:pPr>
       <w:r>
         <w:rPr>
           <w:b/>
           <w:bCs/>
           <w:lang w:val="es-419" w:eastAsia="es-CO"/>
         </w:rPr>
+        <w:lastRenderedPageBreak/>
         <w:t>A continuación, algunos elementos que un protocolo de contacto comercial debería tener</w:t>
       </w:r>
       <w:r>
@@ -6726,7 +7019,6 @@
           <w:bCs/>
           <w:lang w:val="es-419" w:eastAsia="es-CO"/>
         </w:rPr>
-        <w:lastRenderedPageBreak/>
         <w:t>Personalización</w:t>
       </w:r>
       <w:r>
@@ -6795,7 +7087,7 @@
       <w:pPr>
         <w:pStyle w:val="Ttulo2"/>
       </w:pPr>
-      <w:bookmarkStart w:id="15" w:name="_Toc212563409"/>
+      <w:bookmarkStart w:id="15" w:name="_Toc212796979"/>
       <w:r>
         <w:t>Informes</w:t>
       </w:r>
@@ -6853,6 +7145,25 @@
     </w:p>
     <w:p>
       <w:pPr>
+        <w:spacing w:before="0" w:after="160" w:line="259" w:lineRule="auto"/>
+        <w:ind w:firstLine="0"/>
+        <w:rPr>
+          <w:sz w:val="24"/>
+          <w:szCs w:val="24"/>
+          <w:lang w:val="es-419" w:eastAsia="es-CO"/>
+        </w:rPr>
+      </w:pPr>
+      <w:r>
+        <w:rPr>
+          <w:sz w:val="24"/>
+          <w:szCs w:val="24"/>
+          <w:lang w:val="es-419" w:eastAsia="es-CO"/>
+        </w:rPr>
+        <w:br w:type="page"/>
+      </w:r>
+    </w:p>
+    <w:p>
+      <w:pPr>
         <w:pStyle w:val="Tabla"/>
         <w:rPr>
           <w:lang w:val="es-419" w:eastAsia="es-CO"/>
@@ -6862,6 +7173,7 @@
         <w:rPr>
           <w:lang w:val="es-419" w:eastAsia="es-CO"/>
         </w:rPr>
+        <w:lastRenderedPageBreak/>
         <w:t>Estructura básica de un informe de seguimiento comercial</w:t>
       </w:r>
     </w:p>
@@ -7286,7 +7598,6 @@
                 <w:color w:val="000000" w:themeColor="text1"/>
                 <w:szCs w:val="24"/>
               </w:rPr>
-              <w:lastRenderedPageBreak/>
               <w:t>Acciones futuras</w:t>
             </w:r>
           </w:p>
@@ -7333,7 +7644,23 @@
                 <w:szCs w:val="24"/>
                 <w:lang w:val="es-CO"/>
               </w:rPr>
-              <w:t>Enviar cotización adicional, prepara demo.</w:t>
+              <w:t>Enviar cotización adicional, prepara</w:t>
+            </w:r>
+            <w:r>
+              <w:rPr>
+                <w:rFonts w:asciiTheme="minorHAnsi" w:hAnsiTheme="minorHAnsi" w:cstheme="minorHAnsi"/>
+                <w:szCs w:val="24"/>
+                <w:lang w:val="es-CO"/>
+              </w:rPr>
+              <w:t>r</w:t>
+            </w:r>
+            <w:r>
+              <w:rPr>
+                <w:rFonts w:asciiTheme="minorHAnsi" w:hAnsiTheme="minorHAnsi" w:cstheme="minorHAnsi"/>
+                <w:szCs w:val="24"/>
+                <w:lang w:val="es-CO"/>
+              </w:rPr>
+              <w:t xml:space="preserve"> demo.</w:t>
             </w:r>
           </w:p>
         </w:tc>
@@ -7398,7 +7725,7 @@
       <w:pPr>
         <w:pStyle w:val="Ttulo1"/>
       </w:pPr>
-      <w:bookmarkStart w:id="16" w:name="_Toc212563410"/>
+      <w:bookmarkStart w:id="16" w:name="_Toc212796980"/>
       <w:r>
         <w:lastRenderedPageBreak/>
         <w:t>P</w:t>
@@ -7460,7 +7787,7 @@
       <w:pPr>
         <w:pStyle w:val="Ttulo2"/>
       </w:pPr>
-      <w:bookmarkStart w:id="17" w:name="_Toc212563411"/>
+      <w:bookmarkStart w:id="17" w:name="_Toc212796981"/>
       <w:r>
         <w:t>Concepto</w:t>
       </w:r>
@@ -7489,7 +7816,7 @@
       <w:pPr>
         <w:pStyle w:val="Ttulo2"/>
       </w:pPr>
-      <w:bookmarkStart w:id="18" w:name="_Toc212563412"/>
+      <w:bookmarkStart w:id="18" w:name="_Toc212796982"/>
       <w:r>
         <w:t>Objetivos</w:t>
       </w:r>
@@ -7734,7 +8061,7 @@
       <w:pPr>
         <w:pStyle w:val="Ttulo2"/>
       </w:pPr>
-      <w:bookmarkStart w:id="19" w:name="_Toc212563413"/>
+      <w:bookmarkStart w:id="19" w:name="_Toc212796983"/>
       <w:r>
         <w:t>Ben</w:t>
       </w:r>
@@ -8326,7 +8653,7 @@
       <w:pPr>
         <w:pStyle w:val="Ttulo2"/>
       </w:pPr>
-      <w:bookmarkStart w:id="20" w:name="_Toc212563414"/>
+      <w:bookmarkStart w:id="20" w:name="_Toc212796984"/>
       <w:r>
         <w:t>Tipos</w:t>
       </w:r>
@@ -8588,7 +8915,7 @@
       <w:pPr>
         <w:pStyle w:val="Ttulo2"/>
       </w:pPr>
-      <w:bookmarkStart w:id="21" w:name="_Toc212563415"/>
+      <w:bookmarkStart w:id="21" w:name="_Toc212796985"/>
       <w:r>
         <w:t>Estrategias</w:t>
       </w:r>
@@ -9183,7 +9510,7 @@
       <w:pPr>
         <w:pStyle w:val="Titulosgenerales"/>
       </w:pPr>
-      <w:bookmarkStart w:id="22" w:name="_Toc212563416"/>
+      <w:bookmarkStart w:id="22" w:name="_Toc212796986"/>
       <w:r>
         <w:lastRenderedPageBreak/>
         <w:t>S</w:t>
@@ -9331,7 +9658,7 @@
       <w:pPr>
         <w:pStyle w:val="Titulosgenerales"/>
       </w:pPr>
-      <w:bookmarkStart w:id="23" w:name="_Toc212563417"/>
+      <w:bookmarkStart w:id="23" w:name="_Toc212796987"/>
       <w:r>
         <w:lastRenderedPageBreak/>
         <w:t>Glosario</w:t>
@@ -9892,7 +10219,7 @@
       <w:pPr>
         <w:pStyle w:val="Titulosgenerales"/>
       </w:pPr>
-      <w:bookmarkStart w:id="24" w:name="_Toc212563418"/>
+      <w:bookmarkStart w:id="24" w:name="_Toc212796988"/>
       <w:r>
         <w:lastRenderedPageBreak/>
         <w:t>Material complementario</w:t>
@@ -10170,6 +10497,14 @@
               <w:t>Octanaje</w:t>
             </w:r>
             <w:proofErr w:type="spellEnd"/>
+            <w:r>
+              <w:rPr>
+                <w:rStyle w:val="Extranjerismo"/>
+                <w:sz w:val="28"/>
+                <w:szCs w:val="28"/>
+              </w:rPr>
+              <w:t>.</w:t>
+            </w:r>
           </w:p>
         </w:tc>
         <w:tc>
@@ -10675,7 +11010,7 @@
       <w:pPr>
         <w:pStyle w:val="Titulosgenerales"/>
       </w:pPr>
-      <w:bookmarkStart w:id="25" w:name="_Toc212563419"/>
+      <w:bookmarkStart w:id="25" w:name="_Toc212796989"/>
       <w:r>
         <w:lastRenderedPageBreak/>
         <w:t>Referencias bibliográficas</w:t>
@@ -11021,7 +11356,7 @@
       <w:pPr>
         <w:pStyle w:val="Titulosgenerales"/>
       </w:pPr>
-      <w:bookmarkStart w:id="26" w:name="_Toc212563420"/>
+      <w:bookmarkStart w:id="26" w:name="_Toc212796990"/>
       <w:r>
         <w:lastRenderedPageBreak/>
         <w:t>C</w:t>
@@ -18744,10 +19079,6 @@
 </file>
 
 <file path=customXml/item1.xml><?xml version="1.0" encoding="utf-8"?>
-<b:Sources xmlns:b="http://schemas.openxmlformats.org/officeDocument/2006/bibliography" xmlns="http://schemas.openxmlformats.org/officeDocument/2006/bibliography" SelectedStyle="\APASixthEditionOfficeOnline.xsl" StyleName="APA" Version="6"/>
-</file>
-
-<file path=customXml/item2.xml><?xml version="1.0" encoding="utf-8"?>
 <p:properties xmlns:p="http://schemas.microsoft.com/office/2006/metadata/properties" xmlns:xsi="http://www.w3.org/2001/XMLSchema-instance" xmlns:pc="http://schemas.microsoft.com/office/infopath/2007/PartnerControls">
   <documentManagement>
     <TaxCatchAll xmlns="cb45339b-ced9-4d0d-8f64-77573914d53b"/>
@@ -18758,16 +19089,11 @@
 </p:properties>
 </file>
 
-<file path=customXml/item3.xml><?xml version="1.0" encoding="utf-8"?>
-<?mso-contentType ?>
-<FormTemplates xmlns="http://schemas.microsoft.com/sharepoint/v3/contenttype/forms">
-  <Display>DocumentLibraryForm</Display>
-  <Edit>DocumentLibraryForm</Edit>
-  <New>DocumentLibraryForm</New>
-</FormTemplates>
+<file path=customXml/item2.xml><?xml version="1.0" encoding="utf-8"?>
+<b:Sources xmlns:b="http://schemas.openxmlformats.org/officeDocument/2006/bibliography" xmlns="http://schemas.openxmlformats.org/officeDocument/2006/bibliography" SelectedStyle="\APASixthEditionOfficeOnline.xsl" StyleName="APA" Version="6"/>
 </file>
 
-<file path=customXml/item4.xml><?xml version="1.0" encoding="utf-8"?>
+<file path=customXml/item3.xml><?xml version="1.0" encoding="utf-8"?>
 <ct:contentTypeSchema xmlns:ct="http://schemas.microsoft.com/office/2006/metadata/contentType" xmlns:ma="http://schemas.microsoft.com/office/2006/metadata/properties/metaAttributes" ct:_="" ma:_="" ma:contentTypeName="Documento" ma:contentTypeID="0x01010049282E1EDBE9234EA9E6D38F720E265F" ma:contentTypeVersion="15" ma:contentTypeDescription="Crear nuevo documento." ma:contentTypeScope="" ma:versionID="b31c7aa9eaf043a08b87120b3c4916e3">
   <xsd:schema xmlns:xsd="http://www.w3.org/2001/XMLSchema" xmlns:xs="http://www.w3.org/2001/XMLSchema" xmlns:p="http://schemas.microsoft.com/office/2006/metadata/properties" xmlns:ns2="cb45339b-ced9-4d0d-8f64-77573914d53b" xmlns:ns3="43a3ca16-9c26-4813-b83f-4aec9927b43f" targetNamespace="http://schemas.microsoft.com/office/2006/metadata/properties" ma:root="true" ma:fieldsID="3533d065b04d75c457075bc55f1f5315" ns2:_="" ns3:_="">
     <xsd:import namespace="cb45339b-ced9-4d0d-8f64-77573914d53b"/>
@@ -19002,15 +19328,16 @@
 </ct:contentTypeSchema>
 </file>
 
-<file path=customXml/itemProps1.xml><?xml version="1.0" encoding="utf-8"?>
-<ds:datastoreItem xmlns:ds="http://schemas.openxmlformats.org/officeDocument/2006/customXml" ds:itemID="{E8AB44A3-7C62-4BD2-82ED-8ABC209970FA}">
-  <ds:schemaRefs>
-    <ds:schemaRef ds:uri="http://schemas.openxmlformats.org/officeDocument/2006/bibliography"/>
-  </ds:schemaRefs>
-</ds:datastoreItem>
+<file path=customXml/item4.xml><?xml version="1.0" encoding="utf-8"?>
+<?mso-contentType ?>
+<FormTemplates xmlns="http://schemas.microsoft.com/sharepoint/v3/contenttype/forms">
+  <Display>DocumentLibraryForm</Display>
+  <Edit>DocumentLibraryForm</Edit>
+  <New>DocumentLibraryForm</New>
+</FormTemplates>
 </file>
 
-<file path=customXml/itemProps2.xml><?xml version="1.0" encoding="utf-8"?>
+<file path=customXml/itemProps1.xml><?xml version="1.0" encoding="utf-8"?>
 <ds:datastoreItem xmlns:ds="http://schemas.openxmlformats.org/officeDocument/2006/customXml" ds:itemID="{1145D752-ACC1-45E1-AB53-0C756F67FC7F}">
   <ds:schemaRefs>
     <ds:schemaRef ds:uri="http://schemas.microsoft.com/office/2006/metadata/properties"/>
@@ -19021,15 +19348,15 @@
 </ds:datastoreItem>
 </file>
 
-<file path=customXml/itemProps3.xml><?xml version="1.0" encoding="utf-8"?>
-<ds:datastoreItem xmlns:ds="http://schemas.openxmlformats.org/officeDocument/2006/customXml" ds:itemID="{81CBDEC1-3B00-44ED-AD36-0268077980BA}">
+<file path=customXml/itemProps2.xml><?xml version="1.0" encoding="utf-8"?>
+<ds:datastoreItem xmlns:ds="http://schemas.openxmlformats.org/officeDocument/2006/customXml" ds:itemID="{E8AB44A3-7C62-4BD2-82ED-8ABC209970FA}">
   <ds:schemaRefs>
-    <ds:schemaRef ds:uri="http://schemas.microsoft.com/sharepoint/v3/contenttype/forms"/>
+    <ds:schemaRef ds:uri="http://schemas.openxmlformats.org/officeDocument/2006/bibliography"/>
   </ds:schemaRefs>
 </ds:datastoreItem>
 </file>
 
-<file path=customXml/itemProps4.xml><?xml version="1.0" encoding="utf-8"?>
+<file path=customXml/itemProps3.xml><?xml version="1.0" encoding="utf-8"?>
 <ds:datastoreItem xmlns:ds="http://schemas.openxmlformats.org/officeDocument/2006/customXml" ds:itemID="{DF43E046-DB0C-42D1-8C73-AE38B52F1ED7}">
   <ds:schemaRefs>
     <ds:schemaRef ds:uri="http://schemas.microsoft.com/office/2006/metadata/contentType"/>
@@ -19046,4 +19373,12 @@
     <ds:schemaRef ds:uri="http://schemas.microsoft.com/internal/obd"/>
   </ds:schemaRefs>
 </ds:datastoreItem>
+</file>
+
+<file path=customXml/itemProps4.xml><?xml version="1.0" encoding="utf-8"?>
+<ds:datastoreItem xmlns:ds="http://schemas.openxmlformats.org/officeDocument/2006/customXml" ds:itemID="{81CBDEC1-3B00-44ED-AD36-0268077980BA}">
+  <ds:schemaRefs>
+    <ds:schemaRef ds:uri="http://schemas.microsoft.com/sharepoint/v3/contenttype/forms"/>
+  </ds:schemaRefs>
+</ds:datastoreItem>
 </file>
</xml_diff>

<commit_message>
Ajustes de material complemetario y ref bibliograficas
</commit_message>
<xml_diff>
--- a/fuentes/CFA2_62330164_DU.docx
+++ b/fuentes/CFA2_62330164_DU.docx
@@ -92,7 +92,7 @@
               </wp:anchor>
             </w:drawing>
           </mc:Choice>
-          <mc:Fallback xmlns:oel="http://schemas.microsoft.com/office/2019/extlst" xmlns:w16du="http://schemas.microsoft.com/office/word/2023/wordml/word16du" xmlns:w16sdtfl="http://schemas.microsoft.com/office/word/2024/wordml/sdtformatlock">
+          <mc:Fallback xmlns:w16sdtfl="http://schemas.microsoft.com/office/word/2024/wordml/sdtformatlock" xmlns:w16du="http://schemas.microsoft.com/office/word/2023/wordml/word16du" xmlns:oel="http://schemas.microsoft.com/office/2019/extlst">
             <w:pict>
               <v:rect w14:anchorId="4E7873B1" id="Rectángulo 3" o:spid="_x0000_s1026" alt="&quot;&quot;" style="position:absolute;margin-left:-54pt;margin-top:31.65pt;width:613.85pt;height:204pt;z-index:-251655168;visibility:visible;mso-wrap-style:square;mso-height-percent:0;mso-wrap-distance-left:9pt;mso-wrap-distance-top:0;mso-wrap-distance-right:9pt;mso-wrap-distance-bottom:0;mso-position-horizontal:absolute;mso-position-horizontal-relative:text;mso-position-vertical:absolute;mso-position-vertical-relative:text;mso-height-percent:0;mso-height-relative:margin;v-text-anchor:middle" o:gfxdata="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" fillcolor="#00314d" stroked="f" strokeweight="1pt"/>
             </w:pict>
@@ -523,7 +523,7 @@
           <w:r>
             <w:fldChar w:fldCharType="separate"/>
           </w:r>
-          <w:hyperlink w:anchor="_Toc212796964" w:history="1">
+          <w:hyperlink w:anchor="_Toc213430835" w:history="1">
             <w:r>
               <w:rPr>
                 <w:rStyle w:val="Hipervnculo"/>
@@ -550,7 +550,7 @@
                 <w:noProof/>
                 <w:webHidden/>
               </w:rPr>
-              <w:instrText xml:space="preserve"> PAGEREF _Toc212796964 \h </w:instrText>
+              <w:instrText xml:space="preserve"> PAGEREF _Toc213430835 \h </w:instrText>
             </w:r>
             <w:r>
               <w:rPr>
@@ -597,7 +597,7 @@
               <w14:ligatures w14:val="none"/>
             </w:rPr>
           </w:pPr>
-          <w:hyperlink w:anchor="_Toc212796965" w:history="1">
+          <w:hyperlink w:anchor="_Toc213430836" w:history="1">
             <w:r>
               <w:rPr>
                 <w:rStyle w:val="Hipervnculo"/>
@@ -642,7 +642,7 @@
                 <w:noProof/>
                 <w:webHidden/>
               </w:rPr>
-              <w:instrText xml:space="preserve"> PAGEREF _Toc212796965 \h </w:instrText>
+              <w:instrText xml:space="preserve"> PAGEREF _Toc213430836 \h </w:instrText>
             </w:r>
             <w:r>
               <w:rPr>
@@ -685,7 +685,7 @@
               <w14:ligatures w14:val="none"/>
             </w:rPr>
           </w:pPr>
-          <w:hyperlink w:anchor="_Toc212796966" w:history="1">
+          <w:hyperlink w:anchor="_Toc213430837" w:history="1">
             <w:r>
               <w:rPr>
                 <w:rStyle w:val="Hipervnculo"/>
@@ -730,7 +730,7 @@
                 <w:noProof/>
                 <w:webHidden/>
               </w:rPr>
-              <w:instrText xml:space="preserve"> PAGEREF _Toc212796966 \h </w:instrText>
+              <w:instrText xml:space="preserve"> PAGEREF _Toc213430837 \h </w:instrText>
             </w:r>
             <w:r>
               <w:rPr>
@@ -773,7 +773,7 @@
               <w14:ligatures w14:val="none"/>
             </w:rPr>
           </w:pPr>
-          <w:hyperlink w:anchor="_Toc212796967" w:history="1">
+          <w:hyperlink w:anchor="_Toc213430838" w:history="1">
             <w:r>
               <w:rPr>
                 <w:rStyle w:val="Hipervnculo"/>
@@ -818,7 +818,7 @@
                 <w:noProof/>
                 <w:webHidden/>
               </w:rPr>
-              <w:instrText xml:space="preserve"> PAGEREF _Toc212796967 \h </w:instrText>
+              <w:instrText xml:space="preserve"> PAGEREF _Toc213430838 \h </w:instrText>
             </w:r>
             <w:r>
               <w:rPr>
@@ -861,7 +861,7 @@
               <w14:ligatures w14:val="none"/>
             </w:rPr>
           </w:pPr>
-          <w:hyperlink w:anchor="_Toc212796968" w:history="1">
+          <w:hyperlink w:anchor="_Toc213430839" w:history="1">
             <w:r>
               <w:rPr>
                 <w:rStyle w:val="Hipervnculo"/>
@@ -906,7 +906,7 @@
                 <w:noProof/>
                 <w:webHidden/>
               </w:rPr>
-              <w:instrText xml:space="preserve"> PAGEREF _Toc212796968 \h </w:instrText>
+              <w:instrText xml:space="preserve"> PAGEREF _Toc213430839 \h </w:instrText>
             </w:r>
             <w:r>
               <w:rPr>
@@ -949,7 +949,7 @@
               <w14:ligatures w14:val="none"/>
             </w:rPr>
           </w:pPr>
-          <w:hyperlink w:anchor="_Toc212796969" w:history="1">
+          <w:hyperlink w:anchor="_Toc213430840" w:history="1">
             <w:r>
               <w:rPr>
                 <w:rStyle w:val="Hipervnculo"/>
@@ -994,7 +994,7 @@
                 <w:noProof/>
                 <w:webHidden/>
               </w:rPr>
-              <w:instrText xml:space="preserve"> PAGEREF _Toc212796969 \h </w:instrText>
+              <w:instrText xml:space="preserve"> PAGEREF _Toc213430840 \h </w:instrText>
             </w:r>
             <w:r>
               <w:rPr>
@@ -1041,7 +1041,7 @@
               <w14:ligatures w14:val="none"/>
             </w:rPr>
           </w:pPr>
-          <w:hyperlink w:anchor="_Toc212796970" w:history="1">
+          <w:hyperlink w:anchor="_Toc213430841" w:history="1">
             <w:r>
               <w:rPr>
                 <w:rStyle w:val="Hipervnculo"/>
@@ -1086,7 +1086,7 @@
                 <w:noProof/>
                 <w:webHidden/>
               </w:rPr>
-              <w:instrText xml:space="preserve"> PAGEREF _Toc212796970 \h </w:instrText>
+              <w:instrText xml:space="preserve"> PAGEREF _Toc213430841 \h </w:instrText>
             </w:r>
             <w:r>
               <w:rPr>
@@ -1129,7 +1129,7 @@
               <w14:ligatures w14:val="none"/>
             </w:rPr>
           </w:pPr>
-          <w:hyperlink w:anchor="_Toc212796971" w:history="1">
+          <w:hyperlink w:anchor="_Toc213430842" w:history="1">
             <w:r>
               <w:rPr>
                 <w:rStyle w:val="Hipervnculo"/>
@@ -1174,7 +1174,7 @@
                 <w:noProof/>
                 <w:webHidden/>
               </w:rPr>
-              <w:instrText xml:space="preserve"> PAGEREF _Toc212796971 \h </w:instrText>
+              <w:instrText xml:space="preserve"> PAGEREF _Toc213430842 \h </w:instrText>
             </w:r>
             <w:r>
               <w:rPr>
@@ -1217,7 +1217,7 @@
               <w14:ligatures w14:val="none"/>
             </w:rPr>
           </w:pPr>
-          <w:hyperlink w:anchor="_Toc212796972" w:history="1">
+          <w:hyperlink w:anchor="_Toc213430843" w:history="1">
             <w:r>
               <w:rPr>
                 <w:rStyle w:val="Hipervnculo"/>
@@ -1262,7 +1262,7 @@
                 <w:noProof/>
                 <w:webHidden/>
               </w:rPr>
-              <w:instrText xml:space="preserve"> PAGEREF _Toc212796972 \h </w:instrText>
+              <w:instrText xml:space="preserve"> PAGEREF _Toc213430843 \h </w:instrText>
             </w:r>
             <w:r>
               <w:rPr>
@@ -1305,7 +1305,7 @@
               <w14:ligatures w14:val="none"/>
             </w:rPr>
           </w:pPr>
-          <w:hyperlink w:anchor="_Toc212796973" w:history="1">
+          <w:hyperlink w:anchor="_Toc213430844" w:history="1">
             <w:r>
               <w:rPr>
                 <w:rStyle w:val="Hipervnculo"/>
@@ -1350,7 +1350,7 @@
                 <w:noProof/>
                 <w:webHidden/>
               </w:rPr>
-              <w:instrText xml:space="preserve"> PAGEREF _Toc212796973 \h </w:instrText>
+              <w:instrText xml:space="preserve"> PAGEREF _Toc213430844 \h </w:instrText>
             </w:r>
             <w:r>
               <w:rPr>
@@ -1393,7 +1393,7 @@
               <w14:ligatures w14:val="none"/>
             </w:rPr>
           </w:pPr>
-          <w:hyperlink w:anchor="_Toc212796974" w:history="1">
+          <w:hyperlink w:anchor="_Toc213430845" w:history="1">
             <w:r>
               <w:rPr>
                 <w:rStyle w:val="Hipervnculo"/>
@@ -1447,7 +1447,7 @@
                 <w:noProof/>
                 <w:webHidden/>
               </w:rPr>
-              <w:instrText xml:space="preserve"> PAGEREF _Toc212796974 \h </w:instrText>
+              <w:instrText xml:space="preserve"> PAGEREF _Toc213430845 \h </w:instrText>
             </w:r>
             <w:r>
               <w:rPr>
@@ -1494,7 +1494,7 @@
               <w14:ligatures w14:val="none"/>
             </w:rPr>
           </w:pPr>
-          <w:hyperlink w:anchor="_Toc212796975" w:history="1">
+          <w:hyperlink w:anchor="_Toc213430846" w:history="1">
             <w:r>
               <w:rPr>
                 <w:rStyle w:val="Hipervnculo"/>
@@ -1539,7 +1539,7 @@
                 <w:noProof/>
                 <w:webHidden/>
               </w:rPr>
-              <w:instrText xml:space="preserve"> PAGEREF _Toc212796975 \h </w:instrText>
+              <w:instrText xml:space="preserve"> PAGEREF _Toc213430846 \h </w:instrText>
             </w:r>
             <w:r>
               <w:rPr>
@@ -1582,7 +1582,7 @@
               <w14:ligatures w14:val="none"/>
             </w:rPr>
           </w:pPr>
-          <w:hyperlink w:anchor="_Toc212796976" w:history="1">
+          <w:hyperlink w:anchor="_Toc213430847" w:history="1">
             <w:r>
               <w:rPr>
                 <w:rStyle w:val="Hipervnculo"/>
@@ -1627,7 +1627,7 @@
                 <w:noProof/>
                 <w:webHidden/>
               </w:rPr>
-              <w:instrText xml:space="preserve"> PAGEREF _Toc212796976 \h </w:instrText>
+              <w:instrText xml:space="preserve"> PAGEREF _Toc213430847 \h </w:instrText>
             </w:r>
             <w:r>
               <w:rPr>
@@ -1670,7 +1670,7 @@
               <w14:ligatures w14:val="none"/>
             </w:rPr>
           </w:pPr>
-          <w:hyperlink w:anchor="_Toc212796977" w:history="1">
+          <w:hyperlink w:anchor="_Toc213430848" w:history="1">
             <w:r>
               <w:rPr>
                 <w:rStyle w:val="Hipervnculo"/>
@@ -1715,7 +1715,7 @@
                 <w:noProof/>
                 <w:webHidden/>
               </w:rPr>
-              <w:instrText xml:space="preserve"> PAGEREF _Toc212796977 \h </w:instrText>
+              <w:instrText xml:space="preserve"> PAGEREF _Toc213430848 \h </w:instrText>
             </w:r>
             <w:r>
               <w:rPr>
@@ -1758,7 +1758,7 @@
               <w14:ligatures w14:val="none"/>
             </w:rPr>
           </w:pPr>
-          <w:hyperlink w:anchor="_Toc212796978" w:history="1">
+          <w:hyperlink w:anchor="_Toc213430849" w:history="1">
             <w:r>
               <w:rPr>
                 <w:rStyle w:val="Hipervnculo"/>
@@ -1803,7 +1803,7 @@
                 <w:noProof/>
                 <w:webHidden/>
               </w:rPr>
-              <w:instrText xml:space="preserve"> PAGEREF _Toc212796978 \h </w:instrText>
+              <w:instrText xml:space="preserve"> PAGEREF _Toc213430849 \h </w:instrText>
             </w:r>
             <w:r>
               <w:rPr>
@@ -1846,7 +1846,7 @@
               <w14:ligatures w14:val="none"/>
             </w:rPr>
           </w:pPr>
-          <w:hyperlink w:anchor="_Toc212796979" w:history="1">
+          <w:hyperlink w:anchor="_Toc213430850" w:history="1">
             <w:r>
               <w:rPr>
                 <w:rStyle w:val="Hipervnculo"/>
@@ -1891,7 +1891,7 @@
                 <w:noProof/>
                 <w:webHidden/>
               </w:rPr>
-              <w:instrText xml:space="preserve"> PAGEREF _Toc212796979 \h </w:instrText>
+              <w:instrText xml:space="preserve"> PAGEREF _Toc213430850 \h </w:instrText>
             </w:r>
             <w:r>
               <w:rPr>
@@ -1938,7 +1938,7 @@
               <w14:ligatures w14:val="none"/>
             </w:rPr>
           </w:pPr>
-          <w:hyperlink w:anchor="_Toc212796980" w:history="1">
+          <w:hyperlink w:anchor="_Toc213430851" w:history="1">
             <w:r>
               <w:rPr>
                 <w:rStyle w:val="Hipervnculo"/>
@@ -1983,7 +1983,7 @@
                 <w:noProof/>
                 <w:webHidden/>
               </w:rPr>
-              <w:instrText xml:space="preserve"> PAGEREF _Toc212796980 \h </w:instrText>
+              <w:instrText xml:space="preserve"> PAGEREF _Toc213430851 \h </w:instrText>
             </w:r>
             <w:r>
               <w:rPr>
@@ -2026,7 +2026,7 @@
               <w14:ligatures w14:val="none"/>
             </w:rPr>
           </w:pPr>
-          <w:hyperlink w:anchor="_Toc212796981" w:history="1">
+          <w:hyperlink w:anchor="_Toc213430852" w:history="1">
             <w:r>
               <w:rPr>
                 <w:rStyle w:val="Hipervnculo"/>
@@ -2071,7 +2071,7 @@
                 <w:noProof/>
                 <w:webHidden/>
               </w:rPr>
-              <w:instrText xml:space="preserve"> PAGEREF _Toc212796981 \h </w:instrText>
+              <w:instrText xml:space="preserve"> PAGEREF _Toc213430852 \h </w:instrText>
             </w:r>
             <w:r>
               <w:rPr>
@@ -2114,7 +2114,7 @@
               <w14:ligatures w14:val="none"/>
             </w:rPr>
           </w:pPr>
-          <w:hyperlink w:anchor="_Toc212796982" w:history="1">
+          <w:hyperlink w:anchor="_Toc213430853" w:history="1">
             <w:r>
               <w:rPr>
                 <w:rStyle w:val="Hipervnculo"/>
@@ -2159,7 +2159,7 @@
                 <w:noProof/>
                 <w:webHidden/>
               </w:rPr>
-              <w:instrText xml:space="preserve"> PAGEREF _Toc212796982 \h </w:instrText>
+              <w:instrText xml:space="preserve"> PAGEREF _Toc213430853 \h </w:instrText>
             </w:r>
             <w:r>
               <w:rPr>
@@ -2202,7 +2202,7 @@
               <w14:ligatures w14:val="none"/>
             </w:rPr>
           </w:pPr>
-          <w:hyperlink w:anchor="_Toc212796983" w:history="1">
+          <w:hyperlink w:anchor="_Toc213430854" w:history="1">
             <w:r>
               <w:rPr>
                 <w:rStyle w:val="Hipervnculo"/>
@@ -2247,7 +2247,7 @@
                 <w:noProof/>
                 <w:webHidden/>
               </w:rPr>
-              <w:instrText xml:space="preserve"> PAGEREF _Toc212796983 \h </w:instrText>
+              <w:instrText xml:space="preserve"> PAGEREF _Toc213430854 \h </w:instrText>
             </w:r>
             <w:r>
               <w:rPr>
@@ -2290,7 +2290,7 @@
               <w14:ligatures w14:val="none"/>
             </w:rPr>
           </w:pPr>
-          <w:hyperlink w:anchor="_Toc212796984" w:history="1">
+          <w:hyperlink w:anchor="_Toc213430855" w:history="1">
             <w:r>
               <w:rPr>
                 <w:rStyle w:val="Hipervnculo"/>
@@ -2335,7 +2335,7 @@
                 <w:noProof/>
                 <w:webHidden/>
               </w:rPr>
-              <w:instrText xml:space="preserve"> PAGEREF _Toc212796984 \h </w:instrText>
+              <w:instrText xml:space="preserve"> PAGEREF _Toc213430855 \h </w:instrText>
             </w:r>
             <w:r>
               <w:rPr>
@@ -2378,7 +2378,7 @@
               <w14:ligatures w14:val="none"/>
             </w:rPr>
           </w:pPr>
-          <w:hyperlink w:anchor="_Toc212796985" w:history="1">
+          <w:hyperlink w:anchor="_Toc213430856" w:history="1">
             <w:r>
               <w:rPr>
                 <w:rStyle w:val="Hipervnculo"/>
@@ -2423,7 +2423,7 @@
                 <w:noProof/>
                 <w:webHidden/>
               </w:rPr>
-              <w:instrText xml:space="preserve"> PAGEREF _Toc212796985 \h </w:instrText>
+              <w:instrText xml:space="preserve"> PAGEREF _Toc213430856 \h </w:instrText>
             </w:r>
             <w:r>
               <w:rPr>
@@ -2469,7 +2469,7 @@
               <w14:ligatures w14:val="none"/>
             </w:rPr>
           </w:pPr>
-          <w:hyperlink w:anchor="_Toc212796986" w:history="1">
+          <w:hyperlink w:anchor="_Toc213430857" w:history="1">
             <w:r>
               <w:rPr>
                 <w:rStyle w:val="Hipervnculo"/>
@@ -2496,7 +2496,7 @@
                 <w:noProof/>
                 <w:webHidden/>
               </w:rPr>
-              <w:instrText xml:space="preserve"> PAGEREF _Toc212796986 \h </w:instrText>
+              <w:instrText xml:space="preserve"> PAGEREF _Toc213430857 \h </w:instrText>
             </w:r>
             <w:r>
               <w:rPr>
@@ -2542,7 +2542,7 @@
               <w14:ligatures w14:val="none"/>
             </w:rPr>
           </w:pPr>
-          <w:hyperlink w:anchor="_Toc212796987" w:history="1">
+          <w:hyperlink w:anchor="_Toc213430858" w:history="1">
             <w:r>
               <w:rPr>
                 <w:rStyle w:val="Hipervnculo"/>
@@ -2569,7 +2569,7 @@
                 <w:noProof/>
                 <w:webHidden/>
               </w:rPr>
-              <w:instrText xml:space="preserve"> PAGEREF _Toc212796987 \h </w:instrText>
+              <w:instrText xml:space="preserve"> PAGEREF _Toc213430858 \h </w:instrText>
             </w:r>
             <w:r>
               <w:rPr>
@@ -2615,7 +2615,7 @@
               <w14:ligatures w14:val="none"/>
             </w:rPr>
           </w:pPr>
-          <w:hyperlink w:anchor="_Toc212796988" w:history="1">
+          <w:hyperlink w:anchor="_Toc213430859" w:history="1">
             <w:r>
               <w:rPr>
                 <w:rStyle w:val="Hipervnculo"/>
@@ -2642,7 +2642,7 @@
                 <w:noProof/>
                 <w:webHidden/>
               </w:rPr>
-              <w:instrText xml:space="preserve"> PAGEREF _Toc212796988 \h </w:instrText>
+              <w:instrText xml:space="preserve"> PAGEREF _Toc213430859 \h </w:instrText>
             </w:r>
             <w:r>
               <w:rPr>
@@ -2688,7 +2688,7 @@
               <w14:ligatures w14:val="none"/>
             </w:rPr>
           </w:pPr>
-          <w:hyperlink w:anchor="_Toc212796989" w:history="1">
+          <w:hyperlink w:anchor="_Toc213430860" w:history="1">
             <w:r>
               <w:rPr>
                 <w:rStyle w:val="Hipervnculo"/>
@@ -2715,7 +2715,7 @@
                 <w:noProof/>
                 <w:webHidden/>
               </w:rPr>
-              <w:instrText xml:space="preserve"> PAGEREF _Toc212796989 \h </w:instrText>
+              <w:instrText xml:space="preserve"> PAGEREF _Toc213430860 \h </w:instrText>
             </w:r>
             <w:r>
               <w:rPr>
@@ -2761,7 +2761,7 @@
               <w14:ligatures w14:val="none"/>
             </w:rPr>
           </w:pPr>
-          <w:hyperlink w:anchor="_Toc212796990" w:history="1">
+          <w:hyperlink w:anchor="_Toc213430861" w:history="1">
             <w:r>
               <w:rPr>
                 <w:rStyle w:val="Hipervnculo"/>
@@ -2788,7 +2788,7 @@
                 <w:noProof/>
                 <w:webHidden/>
               </w:rPr>
-              <w:instrText xml:space="preserve"> PAGEREF _Toc212796990 \h </w:instrText>
+              <w:instrText xml:space="preserve"> PAGEREF _Toc213430861 \h </w:instrText>
             </w:r>
             <w:r>
               <w:rPr>
@@ -2853,7 +2853,7 @@
       <w:pPr>
         <w:pStyle w:val="Titulosgenerales"/>
       </w:pPr>
-      <w:bookmarkStart w:id="0" w:name="_Toc212796964"/>
+      <w:bookmarkStart w:id="0" w:name="_Toc213430835"/>
       <w:r>
         <w:lastRenderedPageBreak/>
         <w:t>Introducción</w:t>
@@ -3163,7 +3163,7 @@
       <w:pPr>
         <w:pStyle w:val="Ttulo1"/>
       </w:pPr>
-      <w:bookmarkStart w:id="1" w:name="_Toc212796965"/>
+      <w:bookmarkStart w:id="1" w:name="_Toc213430836"/>
       <w:r>
         <w:lastRenderedPageBreak/>
         <w:t>Comunicación comercial</w:t>
@@ -3208,7 +3208,7 @@
       <w:pPr>
         <w:pStyle w:val="Ttulo2"/>
       </w:pPr>
-      <w:bookmarkStart w:id="2" w:name="_Toc212796966"/>
+      <w:bookmarkStart w:id="2" w:name="_Toc213430837"/>
       <w:r>
         <w:t>Concepto</w:t>
       </w:r>
@@ -3240,7 +3240,7 @@
       <w:pPr>
         <w:pStyle w:val="Ttulo2"/>
       </w:pPr>
-      <w:bookmarkStart w:id="3" w:name="_Toc212796967"/>
+      <w:bookmarkStart w:id="3" w:name="_Toc213430838"/>
       <w:r>
         <w:t>Elementos</w:t>
       </w:r>
@@ -3501,7 +3501,7 @@
       <w:pPr>
         <w:pStyle w:val="Ttulo2"/>
       </w:pPr>
-      <w:bookmarkStart w:id="4" w:name="_Toc212796968"/>
+      <w:bookmarkStart w:id="4" w:name="_Toc213430839"/>
       <w:r>
         <w:lastRenderedPageBreak/>
         <w:t>Interferencias</w:t>
@@ -3614,7 +3614,7 @@
       <w:pPr>
         <w:pStyle w:val="Ttulo2"/>
       </w:pPr>
-      <w:bookmarkStart w:id="5" w:name="_Toc212796969"/>
+      <w:bookmarkStart w:id="5" w:name="_Toc213430840"/>
       <w:r>
         <w:t>Herramientas digitales</w:t>
       </w:r>
@@ -3954,7 +3954,7 @@
       <w:pPr>
         <w:pStyle w:val="Ttulo1"/>
       </w:pPr>
-      <w:bookmarkStart w:id="6" w:name="_Toc212796970"/>
+      <w:bookmarkStart w:id="6" w:name="_Toc213430841"/>
       <w:r>
         <w:lastRenderedPageBreak/>
         <w:t>Negociación</w:t>
@@ -4012,7 +4012,7 @@
       <w:pPr>
         <w:pStyle w:val="Ttulo2"/>
       </w:pPr>
-      <w:bookmarkStart w:id="7" w:name="_Toc212796971"/>
+      <w:bookmarkStart w:id="7" w:name="_Toc213430842"/>
       <w:r>
         <w:t>Concepto</w:t>
       </w:r>
@@ -4044,7 +4044,7 @@
       <w:pPr>
         <w:pStyle w:val="Ttulo2"/>
       </w:pPr>
-      <w:bookmarkStart w:id="8" w:name="_Toc212796972"/>
+      <w:bookmarkStart w:id="8" w:name="_Toc213430843"/>
       <w:r>
         <w:t>Modelos</w:t>
       </w:r>
@@ -4672,7 +4672,7 @@
       <w:pPr>
         <w:pStyle w:val="Ttulo2"/>
       </w:pPr>
-      <w:bookmarkStart w:id="9" w:name="_Toc212796973"/>
+      <w:bookmarkStart w:id="9" w:name="_Toc213430844"/>
       <w:r>
         <w:lastRenderedPageBreak/>
         <w:t>Técnicas de anclaje</w:t>
@@ -5003,7 +5003,7 @@
       <w:pPr>
         <w:pStyle w:val="Ttulo2"/>
       </w:pPr>
-      <w:bookmarkStart w:id="10" w:name="_Toc212796974"/>
+      <w:bookmarkStart w:id="10" w:name="_Toc213430845"/>
       <w:r>
         <w:t xml:space="preserve">Desarrollo de </w:t>
       </w:r>
@@ -5735,7 +5735,7 @@
       <w:pPr>
         <w:pStyle w:val="Ttulo1"/>
       </w:pPr>
-      <w:bookmarkStart w:id="11" w:name="_Toc212796975"/>
+      <w:bookmarkStart w:id="11" w:name="_Toc213430846"/>
       <w:r>
         <w:lastRenderedPageBreak/>
         <w:t>Seguimiento</w:t>
@@ -5772,7 +5772,7 @@
       <w:pPr>
         <w:pStyle w:val="Ttulo2"/>
       </w:pPr>
-      <w:bookmarkStart w:id="12" w:name="_Toc212796976"/>
+      <w:bookmarkStart w:id="12" w:name="_Toc213430847"/>
       <w:r>
         <w:t>Técnicas de seguimiento</w:t>
       </w:r>
@@ -6059,7 +6059,7 @@
       <w:pPr>
         <w:pStyle w:val="Ttulo2"/>
       </w:pPr>
-      <w:bookmarkStart w:id="13" w:name="_Toc212796977"/>
+      <w:bookmarkStart w:id="13" w:name="_Toc213430848"/>
       <w:r>
         <w:t>Herramientas de seguimiento</w:t>
       </w:r>
@@ -6859,7 +6859,7 @@
       <w:pPr>
         <w:pStyle w:val="Ttulo2"/>
       </w:pPr>
-      <w:bookmarkStart w:id="14" w:name="_Toc212796978"/>
+      <w:bookmarkStart w:id="14" w:name="_Toc213430849"/>
       <w:r>
         <w:t>Protocolos</w:t>
       </w:r>
@@ -7087,7 +7087,7 @@
       <w:pPr>
         <w:pStyle w:val="Ttulo2"/>
       </w:pPr>
-      <w:bookmarkStart w:id="15" w:name="_Toc212796979"/>
+      <w:bookmarkStart w:id="15" w:name="_Toc213430850"/>
       <w:r>
         <w:t>Informes</w:t>
       </w:r>
@@ -7725,7 +7725,7 @@
       <w:pPr>
         <w:pStyle w:val="Ttulo1"/>
       </w:pPr>
-      <w:bookmarkStart w:id="16" w:name="_Toc212796980"/>
+      <w:bookmarkStart w:id="16" w:name="_Toc213430851"/>
       <w:r>
         <w:lastRenderedPageBreak/>
         <w:t>P</w:t>
@@ -7787,7 +7787,7 @@
       <w:pPr>
         <w:pStyle w:val="Ttulo2"/>
       </w:pPr>
-      <w:bookmarkStart w:id="17" w:name="_Toc212796981"/>
+      <w:bookmarkStart w:id="17" w:name="_Toc213430852"/>
       <w:r>
         <w:t>Concepto</w:t>
       </w:r>
@@ -7816,7 +7816,7 @@
       <w:pPr>
         <w:pStyle w:val="Ttulo2"/>
       </w:pPr>
-      <w:bookmarkStart w:id="18" w:name="_Toc212796982"/>
+      <w:bookmarkStart w:id="18" w:name="_Toc213430853"/>
       <w:r>
         <w:t>Objetivos</w:t>
       </w:r>
@@ -8061,7 +8061,7 @@
       <w:pPr>
         <w:pStyle w:val="Ttulo2"/>
       </w:pPr>
-      <w:bookmarkStart w:id="19" w:name="_Toc212796983"/>
+      <w:bookmarkStart w:id="19" w:name="_Toc213430854"/>
       <w:r>
         <w:t>Ben</w:t>
       </w:r>
@@ -8653,7 +8653,7 @@
       <w:pPr>
         <w:pStyle w:val="Ttulo2"/>
       </w:pPr>
-      <w:bookmarkStart w:id="20" w:name="_Toc212796984"/>
+      <w:bookmarkStart w:id="20" w:name="_Toc213430855"/>
       <w:r>
         <w:t>Tipos</w:t>
       </w:r>
@@ -8915,7 +8915,7 @@
       <w:pPr>
         <w:pStyle w:val="Ttulo2"/>
       </w:pPr>
-      <w:bookmarkStart w:id="21" w:name="_Toc212796985"/>
+      <w:bookmarkStart w:id="21" w:name="_Toc213430856"/>
       <w:r>
         <w:t>Estrategias</w:t>
       </w:r>
@@ -9510,7 +9510,7 @@
       <w:pPr>
         <w:pStyle w:val="Titulosgenerales"/>
       </w:pPr>
-      <w:bookmarkStart w:id="22" w:name="_Toc212796986"/>
+      <w:bookmarkStart w:id="22" w:name="_Toc213430857"/>
       <w:r>
         <w:lastRenderedPageBreak/>
         <w:t>S</w:t>
@@ -9658,7 +9658,7 @@
       <w:pPr>
         <w:pStyle w:val="Titulosgenerales"/>
       </w:pPr>
-      <w:bookmarkStart w:id="23" w:name="_Toc212796987"/>
+      <w:bookmarkStart w:id="23" w:name="_Toc213430858"/>
       <w:r>
         <w:lastRenderedPageBreak/>
         <w:t>Glosario</w:t>
@@ -10219,7 +10219,7 @@
       <w:pPr>
         <w:pStyle w:val="Titulosgenerales"/>
       </w:pPr>
-      <w:bookmarkStart w:id="24" w:name="_Toc212796988"/>
+      <w:bookmarkStart w:id="24" w:name="_Toc213430859"/>
       <w:r>
         <w:lastRenderedPageBreak/>
         <w:t>Material complementario</w:t>
@@ -10379,124 +10379,14 @@
               </w:rPr>
               <w:t xml:space="preserve">Vidal, E. (2023). </w:t>
             </w:r>
-            <w:proofErr w:type="spellStart"/>
             <w:r>
               <w:rPr>
                 <w:rStyle w:val="Extranjerismo"/>
                 <w:sz w:val="28"/>
                 <w:szCs w:val="28"/>
               </w:rPr>
-              <w:t>Técnicas</w:t>
-            </w:r>
-            <w:proofErr w:type="spellEnd"/>
-            <w:r>
-              <w:rPr>
-                <w:rStyle w:val="Extranjerismo"/>
-                <w:sz w:val="28"/>
-                <w:szCs w:val="28"/>
-              </w:rPr>
-              <w:t xml:space="preserve"> de </w:t>
-            </w:r>
-            <w:proofErr w:type="spellStart"/>
-            <w:r>
-              <w:rPr>
-                <w:rStyle w:val="Extranjerismo"/>
-                <w:sz w:val="28"/>
-                <w:szCs w:val="28"/>
-              </w:rPr>
-              <w:t>seguimiento</w:t>
-            </w:r>
-            <w:proofErr w:type="spellEnd"/>
-            <w:r>
-              <w:rPr>
-                <w:rStyle w:val="Extranjerismo"/>
-                <w:sz w:val="28"/>
-                <w:szCs w:val="28"/>
-              </w:rPr>
-              <w:t xml:space="preserve"> </w:t>
-            </w:r>
-            <w:proofErr w:type="spellStart"/>
-            <w:r>
-              <w:rPr>
-                <w:rStyle w:val="Extranjerismo"/>
-                <w:sz w:val="28"/>
-                <w:szCs w:val="28"/>
-              </w:rPr>
-              <w:t>comercial</w:t>
-            </w:r>
-            <w:proofErr w:type="spellEnd"/>
-            <w:r>
-              <w:rPr>
-                <w:rStyle w:val="Extranjerismo"/>
-                <w:sz w:val="28"/>
-                <w:szCs w:val="28"/>
-              </w:rPr>
-              <w:t xml:space="preserve">: </w:t>
-            </w:r>
-            <w:proofErr w:type="spellStart"/>
-            <w:r>
-              <w:rPr>
-                <w:rStyle w:val="Extranjerismo"/>
-                <w:sz w:val="28"/>
-                <w:szCs w:val="28"/>
-              </w:rPr>
-              <w:t>métricas</w:t>
-            </w:r>
-            <w:proofErr w:type="spellEnd"/>
-            <w:r>
-              <w:rPr>
-                <w:rStyle w:val="Extranjerismo"/>
-                <w:sz w:val="28"/>
-                <w:szCs w:val="28"/>
-              </w:rPr>
-              <w:t xml:space="preserve">, </w:t>
-            </w:r>
-            <w:proofErr w:type="spellStart"/>
-            <w:r>
-              <w:rPr>
-                <w:rStyle w:val="Extranjerismo"/>
-                <w:sz w:val="28"/>
-                <w:szCs w:val="28"/>
-              </w:rPr>
-              <w:t>plantillas</w:t>
-            </w:r>
-            <w:proofErr w:type="spellEnd"/>
-            <w:r>
-              <w:rPr>
-                <w:rStyle w:val="Extranjerismo"/>
-                <w:sz w:val="28"/>
-                <w:szCs w:val="28"/>
-              </w:rPr>
-              <w:t xml:space="preserve"> y </w:t>
-            </w:r>
-            <w:proofErr w:type="spellStart"/>
-            <w:r>
-              <w:rPr>
-                <w:rStyle w:val="Extranjerismo"/>
-                <w:sz w:val="28"/>
-                <w:szCs w:val="28"/>
-              </w:rPr>
-              <w:t>ejemplos</w:t>
-            </w:r>
-            <w:proofErr w:type="spellEnd"/>
-            <w:r>
-              <w:rPr>
-                <w:rStyle w:val="Extranjerismo"/>
-                <w:sz w:val="28"/>
-                <w:szCs w:val="28"/>
-              </w:rPr>
-              <w:t xml:space="preserve">. Ventas de Alto </w:t>
-            </w:r>
-            <w:proofErr w:type="spellStart"/>
-            <w:r>
-              <w:rPr>
-                <w:rStyle w:val="Extranjerismo"/>
-                <w:sz w:val="28"/>
-                <w:szCs w:val="28"/>
-              </w:rPr>
-              <w:t>Octanaje</w:t>
-            </w:r>
-            <w:proofErr w:type="spellEnd"/>
+              <w:t>Técnicas de seguimiento comercial: métricas, plantillas y ejemplos. Ventas de Alto Octanaje</w:t>
+            </w:r>
             <w:r>
               <w:rPr>
                 <w:rStyle w:val="Extranjerismo"/>
@@ -10537,32 +10427,20 @@
             <w:pPr>
               <w:pStyle w:val="TextoTablas"/>
               <w:rPr>
-                <w:rStyle w:val="Hipervnculo"/>
-                <w:bCs/>
                 <w:sz w:val="28"/>
                 <w:szCs w:val="28"/>
               </w:rPr>
             </w:pPr>
-            <w:hyperlink r:id="rId18" w:history="1">
+            <w:hyperlink r:id="rId18">
               <w:r>
                 <w:rPr>
                   <w:rStyle w:val="Hipervnculo"/>
-                  <w:bCs/>
                   <w:sz w:val="28"/>
                   <w:szCs w:val="28"/>
                 </w:rPr>
-                <w:t>ventasdealtooctanaje.com</w:t>
+                <w:t>https://www.ventasdealtooctanaje.com/blog/tecnicas-de-seguimiento-comercial-metricas-plantillas-y-ejemplos-de-aplicacion-para-gerentes-y-vendedores</w:t>
               </w:r>
             </w:hyperlink>
-          </w:p>
-          <w:p>
-            <w:pPr>
-              <w:pStyle w:val="TextoTablas"/>
-              <w:rPr>
-                <w:sz w:val="28"/>
-                <w:szCs w:val="28"/>
-              </w:rPr>
-            </w:pPr>
           </w:p>
         </w:tc>
       </w:tr>
@@ -10601,113 +10479,21 @@
                 <w:szCs w:val="28"/>
               </w:rPr>
             </w:pPr>
-            <w:proofErr w:type="spellStart"/>
             <w:r>
               <w:rPr>
                 <w:bCs/>
                 <w:sz w:val="28"/>
                 <w:szCs w:val="28"/>
               </w:rPr>
-              <w:t>Maddio</w:t>
-            </w:r>
-            <w:proofErr w:type="spellEnd"/>
-            <w:r>
-              <w:rPr>
-                <w:bCs/>
-                <w:sz w:val="28"/>
-                <w:szCs w:val="28"/>
-              </w:rPr>
-              <w:t xml:space="preserve">, G. (s.f.). </w:t>
-            </w:r>
-            <w:proofErr w:type="spellStart"/>
+              <w:t xml:space="preserve">Maddio, G. (s.f.). </w:t>
+            </w:r>
             <w:r>
               <w:rPr>
                 <w:rStyle w:val="Extranjerismo"/>
                 <w:sz w:val="28"/>
                 <w:szCs w:val="28"/>
               </w:rPr>
-              <w:t>Técnicas</w:t>
-            </w:r>
-            <w:proofErr w:type="spellEnd"/>
-            <w:r>
-              <w:rPr>
-                <w:rStyle w:val="Extranjerismo"/>
-                <w:sz w:val="28"/>
-                <w:szCs w:val="28"/>
-              </w:rPr>
-              <w:t xml:space="preserve"> de </w:t>
-            </w:r>
-            <w:proofErr w:type="spellStart"/>
-            <w:r>
-              <w:rPr>
-                <w:rStyle w:val="Extranjerismo"/>
-                <w:sz w:val="28"/>
-                <w:szCs w:val="28"/>
-              </w:rPr>
-              <w:t>ventas</w:t>
-            </w:r>
-            <w:proofErr w:type="spellEnd"/>
-            <w:r>
-              <w:rPr>
-                <w:rStyle w:val="Extranjerismo"/>
-                <w:sz w:val="28"/>
-                <w:szCs w:val="28"/>
-              </w:rPr>
-              <w:t xml:space="preserve"> y </w:t>
-            </w:r>
-            <w:proofErr w:type="spellStart"/>
-            <w:r>
-              <w:rPr>
-                <w:rStyle w:val="Extranjerismo"/>
-                <w:sz w:val="28"/>
-                <w:szCs w:val="28"/>
-              </w:rPr>
-              <w:t>comunicación</w:t>
-            </w:r>
-            <w:proofErr w:type="spellEnd"/>
-            <w:r>
-              <w:rPr>
-                <w:rStyle w:val="Extranjerismo"/>
-                <w:sz w:val="28"/>
-                <w:szCs w:val="28"/>
-              </w:rPr>
-              <w:t xml:space="preserve"> </w:t>
-            </w:r>
-            <w:proofErr w:type="spellStart"/>
-            <w:r>
-              <w:rPr>
-                <w:rStyle w:val="Extranjerismo"/>
-                <w:sz w:val="28"/>
-                <w:szCs w:val="28"/>
-              </w:rPr>
-              <w:t>comercial</w:t>
-            </w:r>
-            <w:proofErr w:type="spellEnd"/>
-            <w:r>
-              <w:rPr>
-                <w:rStyle w:val="Extranjerismo"/>
-                <w:sz w:val="28"/>
-                <w:szCs w:val="28"/>
-              </w:rPr>
-              <w:t xml:space="preserve">. Universidad Nacional de </w:t>
-            </w:r>
-            <w:proofErr w:type="spellStart"/>
-            <w:r>
-              <w:rPr>
-                <w:rStyle w:val="Extranjerismo"/>
-                <w:sz w:val="28"/>
-                <w:szCs w:val="28"/>
-              </w:rPr>
-              <w:t>Cuyo</w:t>
-            </w:r>
-            <w:proofErr w:type="spellEnd"/>
-            <w:r>
-              <w:rPr>
-                <w:rStyle w:val="Extranjerismo"/>
-                <w:sz w:val="28"/>
-                <w:szCs w:val="28"/>
-              </w:rPr>
-              <w:t>.</w:t>
+              <w:t>Técnicas de ventas y comunicación comercial. Universidad Nacional de Cuyo.</w:t>
             </w:r>
           </w:p>
         </w:tc>
@@ -10742,32 +10528,20 @@
               <w:pStyle w:val="TextoTablas"/>
               <w:rPr>
                 <w:rStyle w:val="Hipervnculo"/>
-                <w:bCs/>
                 <w:sz w:val="28"/>
                 <w:szCs w:val="28"/>
               </w:rPr>
             </w:pPr>
-            <w:hyperlink r:id="rId19" w:history="1">
+            <w:hyperlink r:id="rId19">
               <w:r>
                 <w:rPr>
                   <w:rStyle w:val="Hipervnculo"/>
-                  <w:bCs/>
                   <w:sz w:val="28"/>
                   <w:szCs w:val="28"/>
                 </w:rPr>
-                <w:t>PDF descargable</w:t>
+                <w:t>https://fce.uncuyo.edu.ar/upload/se-adm-n66-tecnicas-de-ventas-y-comunicacion-comercial-gustavo-maddio.pdf</w:t>
               </w:r>
             </w:hyperlink>
-          </w:p>
-          <w:p>
-            <w:pPr>
-              <w:pStyle w:val="TextoTablas"/>
-              <w:rPr>
-                <w:rStyle w:val="Hipervnculo"/>
-                <w:sz w:val="28"/>
-                <w:szCs w:val="28"/>
-              </w:rPr>
-            </w:pPr>
           </w:p>
         </w:tc>
       </w:tr>
@@ -10809,23 +10583,13 @@
                 <w:szCs w:val="28"/>
               </w:rPr>
             </w:pPr>
-            <w:proofErr w:type="spellStart"/>
             <w:r>
               <w:rPr>
                 <w:bCs/>
                 <w:sz w:val="28"/>
                 <w:szCs w:val="28"/>
               </w:rPr>
-              <w:t>LaGrowthMachine</w:t>
-            </w:r>
-            <w:proofErr w:type="spellEnd"/>
-            <w:r>
-              <w:rPr>
-                <w:bCs/>
-                <w:sz w:val="28"/>
-                <w:szCs w:val="28"/>
-              </w:rPr>
-              <w:t xml:space="preserve">. (2023). </w:t>
+              <w:t xml:space="preserve">LaGrowthMachine. (2023). </w:t>
             </w:r>
             <w:r>
               <w:rPr>
@@ -10833,115 +10597,7 @@
                 <w:sz w:val="28"/>
                 <w:szCs w:val="28"/>
               </w:rPr>
-              <w:t xml:space="preserve">Impulse sus </w:t>
-            </w:r>
-            <w:proofErr w:type="spellStart"/>
-            <w:r>
-              <w:rPr>
-                <w:rStyle w:val="Extranjerismo"/>
-                <w:sz w:val="28"/>
-                <w:szCs w:val="28"/>
-              </w:rPr>
-              <w:t>ventas</w:t>
-            </w:r>
-            <w:proofErr w:type="spellEnd"/>
-            <w:r>
-              <w:rPr>
-                <w:rStyle w:val="Extranjerismo"/>
-                <w:sz w:val="28"/>
-                <w:szCs w:val="28"/>
-              </w:rPr>
-              <w:t xml:space="preserve"> con </w:t>
-            </w:r>
-            <w:proofErr w:type="spellStart"/>
-            <w:r>
-              <w:rPr>
-                <w:rStyle w:val="Extranjerismo"/>
-                <w:sz w:val="28"/>
-                <w:szCs w:val="28"/>
-              </w:rPr>
-              <w:t>estas</w:t>
-            </w:r>
-            <w:proofErr w:type="spellEnd"/>
-            <w:r>
-              <w:rPr>
-                <w:rStyle w:val="Extranjerismo"/>
-                <w:sz w:val="28"/>
-                <w:szCs w:val="28"/>
-              </w:rPr>
-              <w:t xml:space="preserve"> </w:t>
-            </w:r>
-            <w:proofErr w:type="spellStart"/>
-            <w:r>
-              <w:rPr>
-                <w:rStyle w:val="Extranjerismo"/>
-                <w:sz w:val="28"/>
-                <w:szCs w:val="28"/>
-              </w:rPr>
-              <w:t>estrategias</w:t>
-            </w:r>
-            <w:proofErr w:type="spellEnd"/>
-            <w:r>
-              <w:rPr>
-                <w:rStyle w:val="Extranjerismo"/>
-                <w:sz w:val="28"/>
-                <w:szCs w:val="28"/>
-              </w:rPr>
-              <w:t xml:space="preserve"> de </w:t>
-            </w:r>
-            <w:proofErr w:type="spellStart"/>
-            <w:r>
-              <w:rPr>
-                <w:rStyle w:val="Extranjerismo"/>
-                <w:sz w:val="28"/>
-                <w:szCs w:val="28"/>
-              </w:rPr>
-              <w:t>seguimiento</w:t>
-            </w:r>
-            <w:proofErr w:type="spellEnd"/>
-            <w:r>
-              <w:rPr>
-                <w:rStyle w:val="Extranjerismo"/>
-                <w:sz w:val="28"/>
-                <w:szCs w:val="28"/>
-              </w:rPr>
-              <w:t xml:space="preserve"> </w:t>
-            </w:r>
-            <w:proofErr w:type="spellStart"/>
-            <w:r>
-              <w:rPr>
-                <w:rStyle w:val="Extranjerismo"/>
-                <w:sz w:val="28"/>
-                <w:szCs w:val="28"/>
-              </w:rPr>
-              <w:t>comercial</w:t>
-            </w:r>
-            <w:proofErr w:type="spellEnd"/>
-            <w:r>
-              <w:rPr>
-                <w:rStyle w:val="Extranjerismo"/>
-                <w:sz w:val="28"/>
-                <w:szCs w:val="28"/>
-              </w:rPr>
-              <w:t xml:space="preserve">. </w:t>
-            </w:r>
-            <w:proofErr w:type="spellStart"/>
-            <w:r>
-              <w:rPr>
-                <w:rStyle w:val="Extranjerismo"/>
-                <w:sz w:val="28"/>
-                <w:szCs w:val="28"/>
-              </w:rPr>
-              <w:t>LaGrowthMachine</w:t>
-            </w:r>
-            <w:proofErr w:type="spellEnd"/>
-            <w:r>
-              <w:rPr>
-                <w:rStyle w:val="Extranjerismo"/>
-                <w:sz w:val="28"/>
-                <w:szCs w:val="28"/>
-              </w:rPr>
-              <w:t>.</w:t>
+              <w:t>Impulse sus ventas con estas estrategias de seguimiento comercial. LaGrowthMachine.</w:t>
             </w:r>
           </w:p>
         </w:tc>
@@ -10976,32 +10632,20 @@
               <w:pStyle w:val="TextoTablas"/>
               <w:rPr>
                 <w:rStyle w:val="Hipervnculo"/>
-                <w:bCs/>
                 <w:sz w:val="28"/>
                 <w:szCs w:val="28"/>
               </w:rPr>
             </w:pPr>
-            <w:hyperlink r:id="rId20" w:history="1">
+            <w:hyperlink r:id="rId20">
               <w:r>
                 <w:rPr>
                   <w:rStyle w:val="Hipervnculo"/>
-                  <w:bCs/>
                   <w:sz w:val="28"/>
                   <w:szCs w:val="28"/>
                 </w:rPr>
-                <w:t>lagrowthmachine.com</w:t>
+                <w:t>https://lagrowthmachine.com/es/seguimiento-comercial/</w:t>
               </w:r>
             </w:hyperlink>
-          </w:p>
-          <w:p>
-            <w:pPr>
-              <w:pStyle w:val="TextoTablas"/>
-              <w:rPr>
-                <w:rStyle w:val="Hipervnculo"/>
-                <w:sz w:val="28"/>
-                <w:szCs w:val="28"/>
-              </w:rPr>
-            </w:pPr>
           </w:p>
         </w:tc>
       </w:tr>
@@ -11010,7 +10654,7 @@
       <w:pPr>
         <w:pStyle w:val="Titulosgenerales"/>
       </w:pPr>
-      <w:bookmarkStart w:id="25" w:name="_Toc212796989"/>
+      <w:bookmarkStart w:id="25" w:name="_Toc213430860"/>
       <w:r>
         <w:lastRenderedPageBreak/>
         <w:t>Referencias bibliográficas</w:t>
@@ -11025,38 +10669,46 @@
         <w:pStyle w:val="Normal0"/>
         <w:ind w:firstLine="708"/>
         <w:rPr>
-          <w:rStyle w:val="Hipervnculo"/>
-          <w:rFonts w:asciiTheme="minorHAnsi" w:hAnsiTheme="minorHAnsi" w:cstheme="minorHAnsi"/>
+          <w:rFonts w:ascii="Calibri" w:hAnsi="Calibri" w:cs="Calibri"/>
           <w:sz w:val="28"/>
           <w:szCs w:val="28"/>
         </w:rPr>
       </w:pPr>
-      <w:r>
-        <w:rPr>
-          <w:rFonts w:asciiTheme="minorHAnsi" w:hAnsiTheme="minorHAnsi" w:cstheme="minorHAnsi"/>
+      <w:bookmarkStart w:id="26" w:name="_Hlk213430676"/>
+      <w:r>
+        <w:rPr>
+          <w:rFonts w:ascii="Calibri" w:hAnsi="Calibri" w:cs="Calibri"/>
           <w:sz w:val="28"/>
           <w:szCs w:val="28"/>
         </w:rPr>
         <w:t xml:space="preserve">Docsity. (s.f.). Tema 8: La comunicación comercial. Apuntes de Investigación Empresarial. </w:t>
       </w:r>
-      <w:hyperlink r:id="rId21" w:history="1">
+      <w:hyperlink r:id="rId21">
         <w:r>
           <w:rPr>
             <w:rStyle w:val="Hipervnculo"/>
-            <w:rFonts w:asciiTheme="minorHAnsi" w:hAnsiTheme="minorHAnsi" w:cstheme="minorHAnsi"/>
+            <w:rFonts w:ascii="Calibri" w:hAnsi="Calibri" w:cs="Calibri"/>
             <w:sz w:val="28"/>
             <w:szCs w:val="28"/>
           </w:rPr>
-          <w:t>TEMA 8 LA COMUNICACIÓN COMERCIAL La comunicación comercial - Apuntes de Investigación Empresarial para Gerentes | Docsity</w:t>
+          <w:t>https://www.docsity.com/es/docs/tema-8-la-comunicacion-comercial-la-comunicacion-comercial/3402209/</w:t>
         </w:r>
       </w:hyperlink>
+      <w:r>
+        <w:rPr>
+          <w:rFonts w:ascii="Calibri" w:hAnsi="Calibri" w:cs="Calibri"/>
+          <w:sz w:val="28"/>
+          <w:szCs w:val="28"/>
+        </w:rPr>
+        <w:t xml:space="preserve"> </w:t>
+      </w:r>
     </w:p>
     <w:p>
       <w:pPr>
         <w:pStyle w:val="Normal0"/>
         <w:ind w:firstLine="708"/>
         <w:rPr>
-          <w:rFonts w:asciiTheme="minorHAnsi" w:hAnsiTheme="minorHAnsi" w:cstheme="minorHAnsi"/>
+          <w:rFonts w:ascii="Calibri" w:hAnsi="Calibri" w:cs="Calibri"/>
           <w:sz w:val="28"/>
           <w:szCs w:val="28"/>
         </w:rPr>
@@ -11067,14 +10719,14 @@
         <w:pStyle w:val="Normal0"/>
         <w:ind w:firstLine="708"/>
         <w:rPr>
-          <w:rFonts w:asciiTheme="minorHAnsi" w:hAnsiTheme="minorHAnsi" w:cstheme="minorHAnsi"/>
+          <w:rFonts w:ascii="Calibri" w:hAnsi="Calibri" w:cs="Calibri"/>
           <w:sz w:val="28"/>
           <w:szCs w:val="28"/>
         </w:rPr>
       </w:pPr>
       <w:r>
         <w:rPr>
-          <w:rFonts w:asciiTheme="minorHAnsi" w:hAnsiTheme="minorHAnsi" w:cstheme="minorHAnsi"/>
+          <w:rFonts w:ascii="Calibri" w:hAnsi="Calibri" w:cs="Calibri"/>
           <w:sz w:val="28"/>
           <w:szCs w:val="28"/>
         </w:rPr>
@@ -11082,8 +10734,7 @@
       </w:r>
       <w:r>
         <w:rPr>
-          <w:rStyle w:val="Extranjerismo"/>
-          <w:rFonts w:asciiTheme="minorHAnsi" w:hAnsiTheme="minorHAnsi" w:cstheme="minorHAnsi"/>
+          <w:rFonts w:ascii="Calibri" w:hAnsi="Calibri" w:cs="Calibri"/>
           <w:sz w:val="28"/>
           <w:szCs w:val="28"/>
         </w:rPr>
@@ -11091,17 +10742,25 @@
       </w:r>
       <w:r>
         <w:rPr>
-          <w:rFonts w:asciiTheme="minorHAnsi" w:hAnsiTheme="minorHAnsi" w:cstheme="minorHAnsi"/>
+          <w:rFonts w:ascii="Calibri" w:hAnsi="Calibri" w:cs="Calibri"/>
           <w:sz w:val="28"/>
           <w:szCs w:val="28"/>
         </w:rPr>
-        <w:t xml:space="preserve"> y las comunidades de marca [Tesis doctoral, Universidad de Valladolid]. </w:t>
+        <w:t xml:space="preserve"> y las comunidades de marca [Tesis doctoral, Universidad de Valladolid</w:t>
+      </w:r>
+      <w:r>
+        <w:rPr>
+          <w:rFonts w:ascii="Calibri" w:hAnsi="Calibri" w:cs="Calibri"/>
+          <w:sz w:val="28"/>
+          <w:szCs w:val="28"/>
+        </w:rPr>
+        <w:t xml:space="preserve">]. </w:t>
       </w:r>
       <w:hyperlink r:id="rId22" w:history="1">
         <w:r>
           <w:rPr>
             <w:rStyle w:val="Hipervnculo"/>
-            <w:rFonts w:asciiTheme="minorHAnsi" w:hAnsiTheme="minorHAnsi" w:cstheme="minorHAnsi"/>
+            <w:rFonts w:ascii="Calibri" w:hAnsi="Calibri" w:cs="Calibri"/>
             <w:sz w:val="28"/>
             <w:szCs w:val="28"/>
           </w:rPr>
@@ -11114,18 +10773,28 @@
         <w:pStyle w:val="Normal0"/>
         <w:ind w:firstLine="708"/>
         <w:rPr>
-          <w:rFonts w:asciiTheme="minorHAnsi" w:hAnsiTheme="minorHAnsi" w:cstheme="minorHAnsi"/>
+          <w:rFonts w:ascii="Calibri" w:hAnsi="Calibri" w:cs="Calibri"/>
+          <w:szCs w:val="28"/>
+        </w:rPr>
+      </w:pPr>
+    </w:p>
+    <w:p>
+      <w:pPr>
+        <w:pStyle w:val="Normal0"/>
+        <w:ind w:firstLine="708"/>
+        <w:rPr>
+          <w:rFonts w:ascii="Calibri" w:hAnsi="Calibri" w:cs="Calibri"/>
           <w:sz w:val="28"/>
           <w:szCs w:val="28"/>
         </w:rPr>
       </w:pPr>
       <w:r>
         <w:rPr>
-          <w:rFonts w:asciiTheme="minorHAnsi" w:hAnsiTheme="minorHAnsi" w:cstheme="minorHAnsi"/>
+          <w:rFonts w:ascii="Calibri" w:hAnsi="Calibri" w:cs="Calibri"/>
           <w:sz w:val="28"/>
           <w:szCs w:val="28"/>
         </w:rPr>
-        <w:t xml:space="preserve"> </w:t>
+        <w:t xml:space="preserve">Manzanal, M., Chávez, E., &amp; Rivero, A. (2020). Los elementos de la negociación: ¿cómo intervienen dentro de las etapas? Revista CEA, 4(1). </w:t>
       </w:r>
     </w:p>
     <w:p>
@@ -11133,24 +10802,17 @@
         <w:pStyle w:val="Normal0"/>
         <w:ind w:firstLine="708"/>
         <w:rPr>
-          <w:rFonts w:asciiTheme="minorHAnsi" w:hAnsiTheme="minorHAnsi" w:cstheme="minorHAnsi"/>
+          <w:rStyle w:val="Hipervnculo"/>
+          <w:rFonts w:ascii="Calibri" w:hAnsi="Calibri" w:cs="Calibri"/>
           <w:sz w:val="28"/>
           <w:szCs w:val="28"/>
         </w:rPr>
       </w:pPr>
-      <w:r>
-        <w:rPr>
-          <w:rFonts w:asciiTheme="minorHAnsi" w:hAnsiTheme="minorHAnsi" w:cstheme="minorHAnsi"/>
-          <w:sz w:val="28"/>
-          <w:szCs w:val="28"/>
-        </w:rPr>
-        <w:t xml:space="preserve">Manzanal, M., Chávez, E., &amp; Rivero, A. (2020). Los elementos de la negociación: ¿cómo intervienen dentro de las etapas? Revista CEA, 4(1). </w:t>
-      </w:r>
-      <w:hyperlink r:id="rId23" w:history="1">
+      <w:hyperlink r:id="rId23">
         <w:r>
           <w:rPr>
             <w:rStyle w:val="Hipervnculo"/>
-            <w:rFonts w:asciiTheme="minorHAnsi" w:hAnsiTheme="minorHAnsi" w:cstheme="minorHAnsi"/>
+            <w:rFonts w:ascii="Calibri" w:hAnsi="Calibri" w:cs="Calibri"/>
             <w:sz w:val="28"/>
             <w:szCs w:val="28"/>
           </w:rPr>
@@ -11163,7 +10825,7 @@
         <w:pStyle w:val="Normal0"/>
         <w:ind w:firstLine="708"/>
         <w:rPr>
-          <w:rFonts w:asciiTheme="minorHAnsi" w:hAnsiTheme="minorHAnsi" w:cstheme="minorHAnsi"/>
+          <w:rFonts w:ascii="Calibri" w:hAnsi="Calibri" w:cs="Calibri"/>
           <w:sz w:val="28"/>
           <w:szCs w:val="28"/>
         </w:rPr>
@@ -11174,14 +10836,14 @@
         <w:pStyle w:val="Normal0"/>
         <w:ind w:firstLine="708"/>
         <w:rPr>
-          <w:rFonts w:asciiTheme="minorHAnsi" w:hAnsiTheme="minorHAnsi" w:cstheme="minorHAnsi"/>
+          <w:rFonts w:ascii="Calibri" w:hAnsi="Calibri" w:cs="Calibri"/>
           <w:sz w:val="28"/>
           <w:szCs w:val="28"/>
         </w:rPr>
       </w:pPr>
       <w:r>
         <w:rPr>
-          <w:rFonts w:asciiTheme="minorHAnsi" w:hAnsiTheme="minorHAnsi" w:cstheme="minorHAnsi"/>
+          <w:rFonts w:ascii="Calibri" w:hAnsi="Calibri" w:cs="Calibri"/>
           <w:sz w:val="28"/>
           <w:szCs w:val="28"/>
         </w:rPr>
@@ -11193,24 +10855,17 @@
         <w:pStyle w:val="Normal0"/>
         <w:ind w:firstLine="708"/>
         <w:rPr>
-          <w:rFonts w:asciiTheme="minorHAnsi" w:hAnsiTheme="minorHAnsi" w:cstheme="minorHAnsi"/>
+          <w:rStyle w:val="Hipervnculo"/>
+          <w:rFonts w:ascii="Calibri" w:hAnsi="Calibri" w:cs="Calibri"/>
           <w:sz w:val="28"/>
           <w:szCs w:val="28"/>
         </w:rPr>
       </w:pPr>
-      <w:r>
-        <w:rPr>
-          <w:rFonts w:asciiTheme="minorHAnsi" w:hAnsiTheme="minorHAnsi" w:cstheme="minorHAnsi"/>
-          <w:sz w:val="28"/>
-          <w:szCs w:val="28"/>
-        </w:rPr>
-        <w:t xml:space="preserve"> </w:t>
-      </w:r>
       <w:hyperlink r:id="rId24" w:history="1">
         <w:r>
           <w:rPr>
             <w:rStyle w:val="Hipervnculo"/>
-            <w:rFonts w:asciiTheme="minorHAnsi" w:hAnsiTheme="minorHAnsi" w:cstheme="minorHAnsi"/>
+            <w:rFonts w:ascii="Calibri" w:hAnsi="Calibri" w:cs="Calibri"/>
             <w:sz w:val="28"/>
             <w:szCs w:val="28"/>
           </w:rPr>
@@ -11223,7 +10878,7 @@
         <w:pStyle w:val="Normal0"/>
         <w:ind w:firstLine="708"/>
         <w:rPr>
-          <w:rFonts w:asciiTheme="minorHAnsi" w:hAnsiTheme="minorHAnsi" w:cstheme="minorHAnsi"/>
+          <w:rFonts w:ascii="Calibri" w:hAnsi="Calibri" w:cs="Calibri"/>
           <w:sz w:val="28"/>
           <w:szCs w:val="28"/>
         </w:rPr>
@@ -11234,37 +10889,59 @@
         <w:pStyle w:val="Normal0"/>
         <w:ind w:firstLine="708"/>
         <w:rPr>
-          <w:rFonts w:asciiTheme="minorHAnsi" w:hAnsiTheme="minorHAnsi" w:cstheme="minorHAnsi"/>
+          <w:rFonts w:ascii="Calibri" w:hAnsi="Calibri" w:cs="Calibri"/>
           <w:sz w:val="28"/>
           <w:szCs w:val="28"/>
         </w:rPr>
       </w:pPr>
       <w:r>
         <w:rPr>
-          <w:rFonts w:asciiTheme="minorHAnsi" w:hAnsiTheme="minorHAnsi" w:cstheme="minorHAnsi"/>
+          <w:rFonts w:ascii="Calibri" w:hAnsi="Calibri" w:cs="Calibri"/>
           <w:sz w:val="28"/>
           <w:szCs w:val="28"/>
         </w:rPr>
         <w:t xml:space="preserve">Niño Sierra, D. F. (s.f.). Fidelización del cliente. Fundación Universitaria UNIEMPRESARIAL. </w:t>
       </w:r>
+    </w:p>
+    <w:p>
+      <w:pPr>
+        <w:pBdr>
+          <w:top w:val="nil"/>
+          <w:left w:val="nil"/>
+          <w:bottom w:val="nil"/>
+          <w:right w:val="nil"/>
+          <w:between w:val="nil"/>
+        </w:pBdr>
+        <w:ind w:left="1004" w:hanging="720"/>
+        <w:rPr>
+          <w:rFonts w:ascii="Calibri" w:hAnsi="Calibri" w:cs="Calibri"/>
+          <w:szCs w:val="28"/>
+        </w:rPr>
+      </w:pPr>
       <w:hyperlink r:id="rId25" w:history="1">
         <w:r>
           <w:rPr>
             <w:rStyle w:val="Hipervnculo"/>
-            <w:rFonts w:asciiTheme="minorHAnsi" w:hAnsiTheme="minorHAnsi" w:cstheme="minorHAnsi"/>
-            <w:sz w:val="28"/>
+            <w:rFonts w:ascii="Calibri" w:hAnsi="Calibri" w:cs="Calibri"/>
             <w:szCs w:val="28"/>
           </w:rPr>
           <w:t>https://bibliotecadigital.ccb.org.co/server/api/core/bitstreams/a4b5d64d-a649-4170-8d61-6b8b400e6dbd/content</w:t>
         </w:r>
       </w:hyperlink>
+      <w:r>
+        <w:rPr>
+          <w:rFonts w:ascii="Calibri" w:hAnsi="Calibri" w:cs="Calibri"/>
+          <w:szCs w:val="28"/>
+        </w:rPr>
+        <w:t xml:space="preserve"> </w:t>
+      </w:r>
     </w:p>
     <w:p>
       <w:pPr>
         <w:pStyle w:val="Normal0"/>
         <w:ind w:firstLine="708"/>
         <w:rPr>
-          <w:rFonts w:asciiTheme="minorHAnsi" w:hAnsiTheme="minorHAnsi" w:cstheme="minorHAnsi"/>
+          <w:rFonts w:ascii="Calibri" w:hAnsi="Calibri" w:cs="Calibri"/>
           <w:sz w:val="28"/>
           <w:szCs w:val="28"/>
         </w:rPr>
@@ -11275,14 +10952,14 @@
         <w:pStyle w:val="Normal0"/>
         <w:ind w:firstLine="708"/>
         <w:rPr>
-          <w:rFonts w:asciiTheme="minorHAnsi" w:hAnsiTheme="minorHAnsi" w:cstheme="minorHAnsi"/>
+          <w:rFonts w:ascii="Calibri" w:hAnsi="Calibri" w:cs="Calibri"/>
           <w:sz w:val="28"/>
           <w:szCs w:val="28"/>
         </w:rPr>
       </w:pPr>
       <w:r>
         <w:rPr>
-          <w:rFonts w:asciiTheme="minorHAnsi" w:hAnsiTheme="minorHAnsi" w:cstheme="minorHAnsi"/>
+          <w:rFonts w:ascii="Calibri" w:hAnsi="Calibri" w:cs="Calibri"/>
           <w:sz w:val="28"/>
           <w:szCs w:val="28"/>
         </w:rPr>
@@ -11292,7 +10969,7 @@
         <w:r>
           <w:rPr>
             <w:rStyle w:val="Hipervnculo"/>
-            <w:rFonts w:asciiTheme="minorHAnsi" w:hAnsiTheme="minorHAnsi" w:cstheme="minorHAnsi"/>
+            <w:rFonts w:ascii="Calibri" w:hAnsi="Calibri" w:cs="Calibri"/>
             <w:sz w:val="28"/>
             <w:szCs w:val="28"/>
           </w:rPr>
@@ -11302,61 +10979,10 @@
     </w:p>
     <w:p>
       <w:pPr>
-        <w:pStyle w:val="Normal0"/>
-        <w:ind w:firstLine="708"/>
-        <w:rPr>
-          <w:rFonts w:asciiTheme="minorHAnsi" w:hAnsiTheme="minorHAnsi" w:cstheme="minorHAnsi"/>
-          <w:sz w:val="28"/>
-          <w:szCs w:val="28"/>
-        </w:rPr>
-      </w:pPr>
-      <w:r>
-        <w:rPr>
-          <w:rFonts w:asciiTheme="minorHAnsi" w:hAnsiTheme="minorHAnsi" w:cstheme="minorHAnsi"/>
-          <w:sz w:val="28"/>
-          <w:szCs w:val="28"/>
-        </w:rPr>
-        <w:t xml:space="preserve"> </w:t>
-      </w:r>
-    </w:p>
-    <w:p>
-      <w:pPr>
-        <w:pStyle w:val="Normal0"/>
-        <w:ind w:firstLine="708"/>
-        <w:rPr>
-          <w:rFonts w:asciiTheme="minorHAnsi" w:hAnsiTheme="minorHAnsi" w:cstheme="minorHAnsi"/>
-          <w:sz w:val="28"/>
-          <w:szCs w:val="28"/>
-        </w:rPr>
-      </w:pPr>
-    </w:p>
-    <w:p>
-      <w:pPr>
-        <w:pStyle w:val="Normal0"/>
-        <w:ind w:firstLine="708"/>
-        <w:rPr>
-          <w:rFonts w:asciiTheme="minorHAnsi" w:hAnsiTheme="minorHAnsi" w:cstheme="minorHAnsi"/>
-          <w:sz w:val="28"/>
-          <w:szCs w:val="28"/>
-        </w:rPr>
-      </w:pPr>
-    </w:p>
-    <w:p>
-      <w:pPr>
-        <w:pStyle w:val="Normal0"/>
-        <w:ind w:firstLine="708"/>
-        <w:rPr>
-          <w:rFonts w:asciiTheme="minorHAnsi" w:hAnsiTheme="minorHAnsi" w:cstheme="minorHAnsi"/>
-          <w:sz w:val="28"/>
-          <w:szCs w:val="28"/>
-        </w:rPr>
-      </w:pPr>
-    </w:p>
-    <w:p>
-      <w:pPr>
         <w:pStyle w:val="Titulosgenerales"/>
       </w:pPr>
-      <w:bookmarkStart w:id="26" w:name="_Toc212796990"/>
+      <w:bookmarkStart w:id="27" w:name="_Toc213430861"/>
+      <w:bookmarkEnd w:id="26"/>
       <w:r>
         <w:lastRenderedPageBreak/>
         <w:t>C</w:t>
@@ -11364,7 +10990,7 @@
       <w:r>
         <w:t>réditos</w:t>
       </w:r>
-      <w:bookmarkEnd w:id="26"/>
+      <w:bookmarkEnd w:id="27"/>
     </w:p>
     <w:tbl>
       <w:tblPr>
@@ -19079,21 +18705,6 @@
 </file>
 
 <file path=customXml/item1.xml><?xml version="1.0" encoding="utf-8"?>
-<p:properties xmlns:p="http://schemas.microsoft.com/office/2006/metadata/properties" xmlns:xsi="http://www.w3.org/2001/XMLSchema-instance" xmlns:pc="http://schemas.microsoft.com/office/infopath/2007/PartnerControls">
-  <documentManagement>
-    <TaxCatchAll xmlns="cb45339b-ced9-4d0d-8f64-77573914d53b"/>
-    <lcf76f155ced4ddcb4097134ff3c332f xmlns="43a3ca16-9c26-4813-b83f-4aec9927b43f">
-      <Terms xmlns="http://schemas.microsoft.com/office/infopath/2007/PartnerControls"/>
-    </lcf76f155ced4ddcb4097134ff3c332f>
-  </documentManagement>
-</p:properties>
-</file>
-
-<file path=customXml/item2.xml><?xml version="1.0" encoding="utf-8"?>
-<b:Sources xmlns:b="http://schemas.openxmlformats.org/officeDocument/2006/bibliography" xmlns="http://schemas.openxmlformats.org/officeDocument/2006/bibliography" SelectedStyle="\APASixthEditionOfficeOnline.xsl" StyleName="APA" Version="6"/>
-</file>
-
-<file path=customXml/item3.xml><?xml version="1.0" encoding="utf-8"?>
 <ct:contentTypeSchema xmlns:ct="http://schemas.microsoft.com/office/2006/metadata/contentType" xmlns:ma="http://schemas.microsoft.com/office/2006/metadata/properties/metaAttributes" ct:_="" ma:_="" ma:contentTypeName="Documento" ma:contentTypeID="0x01010049282E1EDBE9234EA9E6D38F720E265F" ma:contentTypeVersion="15" ma:contentTypeDescription="Crear nuevo documento." ma:contentTypeScope="" ma:versionID="b31c7aa9eaf043a08b87120b3c4916e3">
   <xsd:schema xmlns:xsd="http://www.w3.org/2001/XMLSchema" xmlns:xs="http://www.w3.org/2001/XMLSchema" xmlns:p="http://schemas.microsoft.com/office/2006/metadata/properties" xmlns:ns2="cb45339b-ced9-4d0d-8f64-77573914d53b" xmlns:ns3="43a3ca16-9c26-4813-b83f-4aec9927b43f" targetNamespace="http://schemas.microsoft.com/office/2006/metadata/properties" ma:root="true" ma:fieldsID="3533d065b04d75c457075bc55f1f5315" ns2:_="" ns3:_="">
     <xsd:import namespace="cb45339b-ced9-4d0d-8f64-77573914d53b"/>
@@ -19328,6 +18939,21 @@
 </ct:contentTypeSchema>
 </file>
 
+<file path=customXml/item2.xml><?xml version="1.0" encoding="utf-8"?>
+<b:Sources xmlns:b="http://schemas.openxmlformats.org/officeDocument/2006/bibliography" xmlns="http://schemas.openxmlformats.org/officeDocument/2006/bibliography" SelectedStyle="\APASixthEditionOfficeOnline.xsl" StyleName="APA" Version="6"/>
+</file>
+
+<file path=customXml/item3.xml><?xml version="1.0" encoding="utf-8"?>
+<p:properties xmlns:p="http://schemas.microsoft.com/office/2006/metadata/properties" xmlns:xsi="http://www.w3.org/2001/XMLSchema-instance" xmlns:pc="http://schemas.microsoft.com/office/infopath/2007/PartnerControls">
+  <documentManagement>
+    <TaxCatchAll xmlns="cb45339b-ced9-4d0d-8f64-77573914d53b"/>
+    <lcf76f155ced4ddcb4097134ff3c332f xmlns="43a3ca16-9c26-4813-b83f-4aec9927b43f">
+      <Terms xmlns="http://schemas.microsoft.com/office/infopath/2007/PartnerControls"/>
+    </lcf76f155ced4ddcb4097134ff3c332f>
+  </documentManagement>
+</p:properties>
+</file>
+
 <file path=customXml/item4.xml><?xml version="1.0" encoding="utf-8"?>
 <?mso-contentType ?>
 <FormTemplates xmlns="http://schemas.microsoft.com/sharepoint/v3/contenttype/forms">
@@ -19338,25 +18964,6 @@
 </file>
 
 <file path=customXml/itemProps1.xml><?xml version="1.0" encoding="utf-8"?>
-<ds:datastoreItem xmlns:ds="http://schemas.openxmlformats.org/officeDocument/2006/customXml" ds:itemID="{1145D752-ACC1-45E1-AB53-0C756F67FC7F}">
-  <ds:schemaRefs>
-    <ds:schemaRef ds:uri="http://schemas.microsoft.com/office/2006/metadata/properties"/>
-    <ds:schemaRef ds:uri="http://schemas.microsoft.com/office/infopath/2007/PartnerControls"/>
-    <ds:schemaRef ds:uri="cb45339b-ced9-4d0d-8f64-77573914d53b"/>
-    <ds:schemaRef ds:uri="43a3ca16-9c26-4813-b83f-4aec9927b43f"/>
-  </ds:schemaRefs>
-</ds:datastoreItem>
-</file>
-
-<file path=customXml/itemProps2.xml><?xml version="1.0" encoding="utf-8"?>
-<ds:datastoreItem xmlns:ds="http://schemas.openxmlformats.org/officeDocument/2006/customXml" ds:itemID="{E8AB44A3-7C62-4BD2-82ED-8ABC209970FA}">
-  <ds:schemaRefs>
-    <ds:schemaRef ds:uri="http://schemas.openxmlformats.org/officeDocument/2006/bibliography"/>
-  </ds:schemaRefs>
-</ds:datastoreItem>
-</file>
-
-<file path=customXml/itemProps3.xml><?xml version="1.0" encoding="utf-8"?>
 <ds:datastoreItem xmlns:ds="http://schemas.openxmlformats.org/officeDocument/2006/customXml" ds:itemID="{DF43E046-DB0C-42D1-8C73-AE38B52F1ED7}">
   <ds:schemaRefs>
     <ds:schemaRef ds:uri="http://schemas.microsoft.com/office/2006/metadata/contentType"/>
@@ -19375,6 +18982,25 @@
 </ds:datastoreItem>
 </file>
 
+<file path=customXml/itemProps2.xml><?xml version="1.0" encoding="utf-8"?>
+<ds:datastoreItem xmlns:ds="http://schemas.openxmlformats.org/officeDocument/2006/customXml" ds:itemID="{E8AB44A3-7C62-4BD2-82ED-8ABC209970FA}">
+  <ds:schemaRefs>
+    <ds:schemaRef ds:uri="http://schemas.openxmlformats.org/officeDocument/2006/bibliography"/>
+  </ds:schemaRefs>
+</ds:datastoreItem>
+</file>
+
+<file path=customXml/itemProps3.xml><?xml version="1.0" encoding="utf-8"?>
+<ds:datastoreItem xmlns:ds="http://schemas.openxmlformats.org/officeDocument/2006/customXml" ds:itemID="{1145D752-ACC1-45E1-AB53-0C756F67FC7F}">
+  <ds:schemaRefs>
+    <ds:schemaRef ds:uri="http://schemas.microsoft.com/office/2006/metadata/properties"/>
+    <ds:schemaRef ds:uri="http://schemas.microsoft.com/office/infopath/2007/PartnerControls"/>
+    <ds:schemaRef ds:uri="cb45339b-ced9-4d0d-8f64-77573914d53b"/>
+    <ds:schemaRef ds:uri="43a3ca16-9c26-4813-b83f-4aec9927b43f"/>
+  </ds:schemaRefs>
+</ds:datastoreItem>
+</file>
+
 <file path=customXml/itemProps4.xml><?xml version="1.0" encoding="utf-8"?>
 <ds:datastoreItem xmlns:ds="http://schemas.openxmlformats.org/officeDocument/2006/customXml" ds:itemID="{81CBDEC1-3B00-44ED-AD36-0268077980BA}">
   <ds:schemaRefs>

</xml_diff>